<commit_message>
Enhance report: add exact episode/grid step counts, 14-dim functional breakdown, and ML-mechanical hybrid low-cost foundation
</commit_message>
<xml_diff>
--- a/data/step_pipeline_report.docx
+++ b/data/step_pipeline_report.docx
@@ -544,7 +544,7 @@
           <w:color w:val="334155"/>
           <w:sz w:val="20"/>
         </w:rPr>
-        <w:t>ロボットアーム（</w:t>
+        <w:t>卓上ロボットアーム（</w:t>
       </w:r>
       <w:r>
         <w:rPr>
@@ -564,7 +564,7 @@
           <w:color w:val="334155"/>
           <w:sz w:val="20"/>
         </w:rPr>
-        <w:t>）を用いて、机上にランダム配置された円柱ペグを台座穴（クリアランス</w:t>
+        <w:t>）を用い、机上にランダム配置された円柱ペグを受台穴（すきま・クリアランスわずか</w:t>
       </w:r>
       <w:r>
         <w:rPr>
@@ -584,7 +584,7 @@
           <w:color w:val="334155"/>
           <w:sz w:val="20"/>
         </w:rPr>
-        <w:t>）へ高精度に自律挿入するタスクを対象とする。</w:t>
+        <w:t>）へ高精度に自律挿入するタスクを対象としました。</w:t>
       </w:r>
     </w:p>
     <w:p>
@@ -607,7 +607,7 @@
           <w:color w:val="0F172A"/>
           <w:sz w:val="20"/>
         </w:rPr>
-        <w:t>自己改善ループの確立</w:t>
+        <w:t>機械学習</w:t>
       </w:r>
       <w:r>
         <w:rPr>
@@ -617,6 +617,26 @@
           <w:color w:val="0F172A"/>
           <w:sz w:val="20"/>
         </w:rPr>
+        <w:t>×</w:t>
+      </w:r>
+      <w:r>
+        <w:rPr>
+          <w:rFonts w:ascii="Yu Gothic" w:hAnsi="Yu Gothic" w:eastAsia="Yu Gothic"/>
+          <w:b/>
+          <w:i w:val="false"/>
+          <w:color w:val="0F172A"/>
+          <w:sz w:val="20"/>
+        </w:rPr>
+        <w:t>機械的制御のハイブリッド構成による低コスト基盤</w:t>
+      </w:r>
+      <w:r>
+        <w:rPr>
+          <w:rFonts w:eastAsia="Yu Gothic" w:ascii="Yu Gothic" w:hAnsi="Yu Gothic"/>
+          <w:b/>
+          <w:i w:val="false"/>
+          <w:color w:val="0F172A"/>
+          <w:sz w:val="20"/>
+        </w:rPr>
         <w:t xml:space="preserve">: </w:t>
       </w:r>
       <w:r>
@@ -627,7 +647,7 @@
           <w:color w:val="334155"/>
           <w:sz w:val="20"/>
         </w:rPr>
-        <w:t>人手によるテレオペレーション（教示記録）の収集限界と複合誤差の課題に対し、機構学的・幾何学的拘束を取り入れた高精度物理エキスパートを構築し、そこから得られるデータを用いて生徒</w:t>
+        <w:t>カメラ画像から作業空間内にある目的のペグを正しく探索・特定し、アームの接近や運搬といった柔軟な軌道動作は【機械学習（模倣学習・</w:t>
       </w:r>
       <w:r>
         <w:rPr>
@@ -647,27 +667,27 @@
           <w:color w:val="334155"/>
           <w:sz w:val="20"/>
         </w:rPr>
-        <w:t>モデルへ知識蒸留するエンドツーエンドの</w:t>
-      </w:r>
-      <w:r>
-        <w:rPr>
-          <w:rFonts w:eastAsia="Yu Gothic" w:ascii="Yu Gothic" w:hAnsi="Yu Gothic"/>
-          <w:b w:val="false"/>
-          <w:i w:val="false"/>
-          <w:color w:val="334155"/>
-          <w:sz w:val="20"/>
-        </w:rPr>
-        <w:t>MLOps/RobOps</w:t>
-      </w:r>
-      <w:r>
-        <w:rPr>
-          <w:rFonts w:ascii="Yu Gothic" w:hAnsi="Yu Gothic" w:eastAsia="Yu Gothic"/>
-          <w:b w:val="false"/>
-          <w:i w:val="false"/>
-          <w:color w:val="334155"/>
-          <w:sz w:val="20"/>
-        </w:rPr>
-        <w:t>パイプラインを確立した。</w:t>
+        <w:t>モデル）】が担当。一方で、把持圧の微調整、台座外周壁への突き当て整列、直立化、接触反力を逃がすコンプライアンス解放といった物理的・機構的な安全性は【機械的・幾何学的な制御】が確実に担う『ハイブリッド構成』を採用しました。高価な力覚センサや巨大モデルに頼らず、安価な</w:t>
+      </w:r>
+      <w:r>
+        <w:rPr>
+          <w:rFonts w:eastAsia="Yu Gothic" w:ascii="Yu Gothic" w:hAnsi="Yu Gothic"/>
+          <w:b w:val="false"/>
+          <w:i w:val="false"/>
+          <w:color w:val="334155"/>
+          <w:sz w:val="20"/>
+        </w:rPr>
+        <w:t>4</w:t>
+      </w:r>
+      <w:r>
+        <w:rPr>
+          <w:rFonts w:ascii="Yu Gothic" w:hAnsi="Yu Gothic" w:eastAsia="Yu Gothic"/>
+          <w:b w:val="false"/>
+          <w:i w:val="false"/>
+          <w:color w:val="334155"/>
+          <w:sz w:val="20"/>
+        </w:rPr>
+        <w:t>軸アームでも精密作業を安定成功できる低コストな動作基盤を実現しています。</w:t>
       </w:r>
     </w:p>
     <w:p>
@@ -690,6 +710,109 @@
           <w:color w:val="0F172A"/>
           <w:sz w:val="20"/>
         </w:rPr>
+        <w:t>自己改善ループ（</w:t>
+      </w:r>
+      <w:r>
+        <w:rPr>
+          <w:rFonts w:eastAsia="Yu Gothic" w:ascii="Yu Gothic" w:hAnsi="Yu Gothic"/>
+          <w:b/>
+          <w:i w:val="false"/>
+          <w:color w:val="0F172A"/>
+          <w:sz w:val="20"/>
+        </w:rPr>
+        <w:t>RobOps/MLOps</w:t>
+      </w:r>
+      <w:r>
+        <w:rPr>
+          <w:rFonts w:ascii="Yu Gothic" w:hAnsi="Yu Gothic" w:eastAsia="Yu Gothic"/>
+          <w:b/>
+          <w:i w:val="false"/>
+          <w:color w:val="0F172A"/>
+          <w:sz w:val="20"/>
+        </w:rPr>
+        <w:t>）の確立</w:t>
+      </w:r>
+      <w:r>
+        <w:rPr>
+          <w:rFonts w:eastAsia="Yu Gothic" w:ascii="Yu Gothic" w:hAnsi="Yu Gothic"/>
+          <w:b/>
+          <w:i w:val="false"/>
+          <w:color w:val="0F172A"/>
+          <w:sz w:val="20"/>
+        </w:rPr>
+        <w:t xml:space="preserve">: </w:t>
+      </w:r>
+      <w:r>
+        <w:rPr>
+          <w:rFonts w:ascii="Yu Gothic" w:hAnsi="Yu Gothic" w:eastAsia="Yu Gothic"/>
+          <w:b w:val="false"/>
+          <w:i w:val="false"/>
+          <w:color w:val="334155"/>
+          <w:sz w:val="20"/>
+        </w:rPr>
+        <w:t>人手による遠隔操作（テレオペレーション）はお手本データ収集の負担が極めて重く、操作ブレによる誤差が積み重なる課題がありました。そこで、機構学・幾何学に基づき『</w:t>
+      </w:r>
+      <w:r>
+        <w:rPr>
+          <w:rFonts w:eastAsia="Yu Gothic" w:ascii="Yu Gothic" w:hAnsi="Yu Gothic"/>
+          <w:b w:val="false"/>
+          <w:i w:val="false"/>
+          <w:color w:val="334155"/>
+          <w:sz w:val="20"/>
+        </w:rPr>
+        <w:t>100%</w:t>
+      </w:r>
+      <w:r>
+        <w:rPr>
+          <w:rFonts w:ascii="Yu Gothic" w:hAnsi="Yu Gothic" w:eastAsia="Yu Gothic"/>
+          <w:b w:val="false"/>
+          <w:i w:val="false"/>
+          <w:color w:val="334155"/>
+          <w:sz w:val="20"/>
+        </w:rPr>
+        <w:t>成功する物理エキスパート』を構築し、そこから得られるデータを用いて生徒モデルへ知識蒸留（</w:t>
+      </w:r>
+      <w:r>
+        <w:rPr>
+          <w:rFonts w:eastAsia="Yu Gothic" w:ascii="Yu Gothic" w:hAnsi="Yu Gothic"/>
+          <w:b w:val="false"/>
+          <w:i w:val="false"/>
+          <w:color w:val="334155"/>
+          <w:sz w:val="20"/>
+        </w:rPr>
+        <w:t>Policy Distillation</w:t>
+      </w:r>
+      <w:r>
+        <w:rPr>
+          <w:rFonts w:ascii="Yu Gothic" w:hAnsi="Yu Gothic" w:eastAsia="Yu Gothic"/>
+          <w:b w:val="false"/>
+          <w:i w:val="false"/>
+          <w:color w:val="334155"/>
+          <w:sz w:val="20"/>
+        </w:rPr>
+        <w:t>）する自己改善ループを確立しました。</w:t>
+      </w:r>
+    </w:p>
+    <w:p>
+      <w:pPr>
+        <w:pStyle w:val="ListBullet"/>
+        <w:numPr>
+          <w:ilvl w:val="0"/>
+          <w:numId w:val="1"/>
+        </w:numPr>
+        <w:spacing w:lineRule="auto" w:line="300" w:before="20" w:after="60"/>
+        <w:ind w:left="360" w:hanging="360"/>
+        <w:contextualSpacing/>
+        <w:rPr/>
+      </w:pPr>
+      <w:r>
+        <w:rPr>
+          <w:rFonts w:ascii="Yu Gothic" w:hAnsi="Yu Gothic" w:eastAsia="Yu Gothic"/>
+          <w:b/>
+          <w:i w:val="false"/>
+          <w:color w:val="0F172A"/>
+          <w:sz w:val="20"/>
+        </w:rPr>
         <w:t>全工程の構成</w:t>
       </w:r>
       <w:r>
@@ -890,7 +1013,7 @@
           <w:color w:val="334155"/>
           <w:sz w:val="20"/>
         </w:rPr>
-        <w:t>工程で構成される。</w:t>
+        <w:t>工程で構成されます。</w:t>
       </w:r>
     </w:p>
     <w:tbl>
@@ -1969,7 +2092,7 @@
           <w:color w:val="334155"/>
           <w:sz w:val="20"/>
         </w:rPr>
-        <w:t>ポート）経由でブラウザから直接モニタリング可能なヘッドレス構成を採用。</w:t>
+        <w:t>ポート）経由でブラウザから直接モニタリング可能な構成を採用。</w:t>
       </w:r>
     </w:p>
     <w:p>
@@ -2155,26 +2278,6 @@
           <w:color w:val="334155"/>
           <w:sz w:val="20"/>
         </w:rPr>
-        <w:t>、</w:t>
-      </w:r>
-      <w:r>
-        <w:rPr>
-          <w:rFonts w:eastAsia="Yu Gothic" w:ascii="Yu Gothic" w:hAnsi="Yu Gothic"/>
-          <w:b w:val="false"/>
-          <w:i w:val="false"/>
-          <w:color w:val="334155"/>
-          <w:sz w:val="20"/>
-        </w:rPr>
-        <w:t>FOV 1.047 rad</w:t>
-      </w:r>
-      <w:r>
-        <w:rPr>
-          <w:rFonts w:ascii="Yu Gothic" w:hAnsi="Yu Gothic" w:eastAsia="Yu Gothic"/>
-          <w:b w:val="false"/>
-          <w:i w:val="false"/>
-          <w:color w:val="334155"/>
-          <w:sz w:val="20"/>
-        </w:rPr>
         <w:t xml:space="preserve">）およびサブカメラ（斜め側面視点：解像度 </w:t>
       </w:r>
       <w:r>
@@ -2195,7 +2298,7 @@
           <w:color w:val="334155"/>
           <w:sz w:val="20"/>
         </w:rPr>
-        <w:t>）を配置。作業空間の遮蔽（オクルージョン）を回避。</w:t>
+        <w:t>）を配置し、作業空間の遮蔽（オクルージョン）を回避。</w:t>
       </w:r>
     </w:p>
     <w:p>
@@ -2278,27 +2381,7 @@
           <w:color w:val="334155"/>
           <w:sz w:val="20"/>
         </w:rPr>
-        <w:t xml:space="preserve">、質量 </w:t>
-      </w:r>
-      <w:r>
-        <w:rPr>
-          <w:rFonts w:eastAsia="Yu Gothic" w:ascii="Yu Gothic" w:hAnsi="Yu Gothic"/>
-          <w:b w:val="false"/>
-          <w:i w:val="false"/>
-          <w:color w:val="334155"/>
-          <w:sz w:val="20"/>
-        </w:rPr>
-        <w:t>0.05 kg</w:t>
-      </w:r>
-      <w:r>
-        <w:rPr>
-          <w:rFonts w:ascii="Yu Gothic" w:hAnsi="Yu Gothic" w:eastAsia="Yu Gothic"/>
-          <w:b w:val="false"/>
-          <w:i w:val="false"/>
-          <w:color w:val="334155"/>
-          <w:sz w:val="20"/>
-        </w:rPr>
-        <w:t xml:space="preserve">、赤・緑・青の各色バリエーション）および受台ベース（穴径 </w:t>
+        <w:t xml:space="preserve">、赤・緑・青の各色）および受台ベース（穴径 </w:t>
       </w:r>
       <w:r>
         <w:rPr>
@@ -2438,7 +2521,7 @@
           <w:color w:val="334155"/>
           <w:sz w:val="20"/>
         </w:rPr>
-        <w:t>人間オペレータによるテレオペレーションを通じて、タスク達成（ペグ把持・整姿・挿入）に必要な初期のお手本軌道（</w:t>
+        <w:t>人間オペレータによる遠隔操作を通じて、タスク達成（ペグ把持・整姿・挿入）に必要な初期のお手本軌道（</w:t>
       </w:r>
       <w:r>
         <w:rPr>
@@ -2531,7 +2614,7 @@
           <w:color w:val="334155"/>
           <w:sz w:val="20"/>
         </w:rPr>
-        <w:t>を展開し、目標位置姿勢に対する数値逆運動学（</w:t>
+        <w:t>を展開し、目標位置姿勢に対する逆運動学（</w:t>
       </w:r>
       <w:r>
         <w:rPr>
@@ -2614,27 +2697,7 @@
           <w:color w:val="334155"/>
           <w:sz w:val="20"/>
         </w:rPr>
-        <w:t>軸関節現在角（</w:t>
-      </w:r>
-      <w:r>
-        <w:rPr>
-          <w:rFonts w:eastAsia="Yu Gothic" w:ascii="Yu Gothic" w:hAnsi="Yu Gothic"/>
-          <w:b w:val="false"/>
-          <w:i w:val="false"/>
-          <w:color w:val="334155"/>
-          <w:sz w:val="20"/>
-        </w:rPr>
-        <w:t>Position</w:t>
-      </w:r>
-      <w:r>
-        <w:rPr>
-          <w:rFonts w:ascii="Yu Gothic" w:hAnsi="Yu Gothic" w:eastAsia="Yu Gothic"/>
-          <w:b w:val="false"/>
-          <w:i w:val="false"/>
-          <w:color w:val="334155"/>
-          <w:sz w:val="20"/>
-        </w:rPr>
-        <w:t>）、グリッパー開度、双眼カメラ</w:t>
+        <w:t>軸関節現在角、グリッパー開度、双眼カメラ</w:t>
       </w:r>
       <w:r>
         <w:rPr>
@@ -2654,27 +2717,7 @@
           <w:color w:val="334155"/>
           <w:sz w:val="20"/>
         </w:rPr>
-        <w:t>フレーム（</w:t>
-      </w:r>
-      <w:r>
-        <w:rPr>
-          <w:rFonts w:eastAsia="Yu Gothic" w:ascii="Yu Gothic" w:hAnsi="Yu Gothic"/>
-          <w:b w:val="false"/>
-          <w:i w:val="false"/>
-          <w:color w:val="334155"/>
-          <w:sz w:val="20"/>
-        </w:rPr>
-        <w:t>Main/Sub</w:t>
-      </w:r>
-      <w:r>
-        <w:rPr>
-          <w:rFonts w:ascii="Yu Gothic" w:hAnsi="Yu Gothic" w:eastAsia="Yu Gothic"/>
-          <w:b w:val="false"/>
-          <w:i w:val="false"/>
-          <w:color w:val="334155"/>
-          <w:sz w:val="20"/>
-        </w:rPr>
-        <w:t>）、エンドエフェクタ</w:t>
+        <w:t>フレーム、エンドエフェクタ</w:t>
       </w:r>
       <w:r>
         <w:rPr>
@@ -2770,7 +2813,7 @@
           <w:color w:val="334155"/>
           <w:sz w:val="20"/>
         </w:rPr>
-        <w:t>マウスポインタ操作による微細な位置決めのブレ、手ブレ、オペレータの疲労に伴う軌道ばらつきが発生。</w:t>
+        <w:t>マウス操作による微細な位置決めのブレ、手ブレ、オペレータの疲労に伴う軌道ばらつきが発生。</w:t>
       </w:r>
     </w:p>
     <w:p>
@@ -2823,7 +2866,7 @@
           <w:color w:val="334155"/>
           <w:sz w:val="20"/>
         </w:rPr>
-        <w:t>エピソードあたり数分を要し、機械学習の汎化に必要な数十〜数百エピソードの収集が人的に極めて高コスト。</w:t>
+        <w:t>回あたり数分を要し、機械学習に必要な数十〜数百エピソードの収集が人的に極めて高コスト。</w:t>
       </w:r>
     </w:p>
     <w:p>
@@ -2936,7 +2979,7 @@
           <w:color w:val="0F172A"/>
           <w:sz w:val="20"/>
         </w:rPr>
-        <w:t>目的</w:t>
+        <w:t>サンプリング周期の統一（厳格時間同期）</w:t>
       </w:r>
       <w:r>
         <w:rPr>
@@ -2956,7 +2999,7 @@
           <w:color w:val="334155"/>
           <w:sz w:val="20"/>
         </w:rPr>
-        <w:t>サンプリング周波数の異なる非同期センサ群（関節角</w:t>
+        <w:t>取得タイミングの異なるセンサ群（関節角</w:t>
       </w:r>
       <w:r>
         <w:rPr>
@@ -2996,7 +3039,47 @@
           <w:color w:val="334155"/>
           <w:sz w:val="20"/>
         </w:rPr>
-        <w:t>）を統一し、ニューラルネットワークに適したクリーンな学習用データセットを構築。</w:t>
+        <w:t>）を、</w:t>
+      </w:r>
+      <w:r>
+        <w:rPr>
+          <w:rFonts w:eastAsia="Yu Gothic" w:ascii="Yu Gothic" w:hAnsi="Yu Gothic"/>
+          <w:b w:val="false"/>
+          <w:i w:val="false"/>
+          <w:color w:val="334155"/>
+          <w:sz w:val="20"/>
+        </w:rPr>
+        <w:t>20Hz</w:t>
+      </w:r>
+      <w:r>
+        <w:rPr>
+          <w:rFonts w:ascii="Yu Gothic" w:hAnsi="Yu Gothic" w:eastAsia="Yu Gothic"/>
+          <w:b w:val="false"/>
+          <w:i w:val="false"/>
+          <w:color w:val="334155"/>
+          <w:sz w:val="20"/>
+        </w:rPr>
+        <w:t>（</w:t>
+      </w:r>
+      <w:r>
+        <w:rPr>
+          <w:rFonts w:eastAsia="Yu Gothic" w:ascii="Yu Gothic" w:hAnsi="Yu Gothic"/>
+          <w:b w:val="false"/>
+          <w:i w:val="false"/>
+          <w:color w:val="334155"/>
+          <w:sz w:val="20"/>
+        </w:rPr>
+        <w:t>50</w:t>
+      </w:r>
+      <w:r>
+        <w:rPr>
+          <w:rFonts w:ascii="Yu Gothic" w:hAnsi="Yu Gothic" w:eastAsia="Yu Gothic"/>
+          <w:b w:val="false"/>
+          <w:i w:val="false"/>
+          <w:color w:val="334155"/>
+          <w:sz w:val="20"/>
+        </w:rPr>
+        <w:t>ミリ秒刻み）で完全同期させ、時間のズレによる誤学習や因果性の破綻を防止。</w:t>
       </w:r>
     </w:p>
     <w:p>
@@ -3013,83 +3096,495 @@
       </w:pPr>
       <w:r>
         <w:rPr>
-          <w:rFonts w:ascii="Yu Gothic" w:hAnsi="Yu Gothic" w:eastAsia="Yu Gothic"/>
+          <w:rFonts w:eastAsia="Yu Gothic" w:ascii="Yu Gothic" w:hAnsi="Yu Gothic"/>
           <w:b/>
           <w:i w:val="false"/>
           <w:color w:val="0F172A"/>
           <w:sz w:val="20"/>
         </w:rPr>
-        <w:t>厳格時間同期</w:t>
-      </w:r>
-      <w:r>
-        <w:rPr>
-          <w:rFonts w:eastAsia="Yu Gothic" w:ascii="Yu Gothic" w:hAnsi="Yu Gothic"/>
+        <w:t>14</w:t>
+      </w:r>
+      <w:r>
+        <w:rPr>
+          <w:rFonts w:ascii="Yu Gothic" w:hAnsi="Yu Gothic" w:eastAsia="Yu Gothic"/>
           <w:b/>
           <w:i w:val="false"/>
           <w:color w:val="0F172A"/>
           <w:sz w:val="20"/>
         </w:rPr>
+        <w:t>次元物理アフォーダンス特徴量ベクトルの導入</w:t>
+      </w:r>
+      <w:r>
+        <w:rPr>
+          <w:rFonts w:eastAsia="Yu Gothic" w:ascii="Yu Gothic" w:hAnsi="Yu Gothic"/>
+          <w:b/>
+          <w:i w:val="false"/>
+          <w:color w:val="0F172A"/>
+          <w:sz w:val="20"/>
+        </w:rPr>
         <w:t xml:space="preserve">: </w:t>
       </w:r>
       <w:r>
         <w:rPr>
-          <w:rFonts w:eastAsia="Yu Gothic" w:ascii="Yu Gothic" w:hAnsi="Yu Gothic"/>
-          <w:b w:val="false"/>
-          <w:i w:val="false"/>
-          <w:color w:val="334155"/>
-          <w:sz w:val="20"/>
-        </w:rPr>
-        <w:t xml:space="preserve">ApproximateTimeSynchronizer </w:t>
-      </w:r>
-      <w:r>
-        <w:rPr>
-          <w:rFonts w:ascii="Yu Gothic" w:hAnsi="Yu Gothic" w:eastAsia="Yu Gothic"/>
-          <w:b w:val="false"/>
-          <w:i w:val="false"/>
-          <w:color w:val="334155"/>
-          <w:sz w:val="20"/>
-        </w:rPr>
-        <w:t xml:space="preserve">により </w:t>
-      </w:r>
-      <w:r>
-        <w:rPr>
-          <w:rFonts w:eastAsia="Yu Gothic" w:ascii="Yu Gothic" w:hAnsi="Yu Gothic"/>
-          <w:b w:val="false"/>
-          <w:i w:val="false"/>
-          <w:color w:val="334155"/>
-          <w:sz w:val="20"/>
-        </w:rPr>
-        <w:t>20Hz (50ms</w:t>
-      </w:r>
-      <w:r>
-        <w:rPr>
-          <w:rFonts w:ascii="Yu Gothic" w:hAnsi="Yu Gothic" w:eastAsia="Yu Gothic"/>
-          <w:b w:val="false"/>
-          <w:i w:val="false"/>
-          <w:color w:val="334155"/>
-          <w:sz w:val="20"/>
-        </w:rPr>
-        <w:t>刻み</w:t>
-      </w:r>
-      <w:r>
-        <w:rPr>
-          <w:rFonts w:eastAsia="Yu Gothic" w:ascii="Yu Gothic" w:hAnsi="Yu Gothic"/>
-          <w:b w:val="false"/>
-          <w:i w:val="false"/>
-          <w:color w:val="334155"/>
-          <w:sz w:val="20"/>
-        </w:rPr>
-        <w:t xml:space="preserve">) </w:t>
-      </w:r>
-      <w:r>
-        <w:rPr>
-          <w:rFonts w:ascii="Yu Gothic" w:hAnsi="Yu Gothic" w:eastAsia="Yu Gothic"/>
-          <w:b w:val="false"/>
-          <w:i w:val="false"/>
-          <w:color w:val="334155"/>
-          <w:sz w:val="20"/>
-        </w:rPr>
-        <w:t>で画像フレームと関節状態を完全同期。ジッターやタイムラグによる因果性破綻を防止。</w:t>
+          <w:rFonts w:ascii="Yu Gothic" w:hAnsi="Yu Gothic" w:eastAsia="Yu Gothic"/>
+          <w:b w:val="false"/>
+          <w:i w:val="false"/>
+          <w:color w:val="334155"/>
+          <w:sz w:val="20"/>
+        </w:rPr>
+        <w:t>画像や関節角度だけに頼るのではなく、ロボットが状況を直感的に判断できるよう、幾何情報・進行度・状態をまとめた</w:t>
+      </w:r>
+      <w:r>
+        <w:rPr>
+          <w:rFonts w:eastAsia="Yu Gothic" w:ascii="Yu Gothic" w:hAnsi="Yu Gothic"/>
+          <w:b w:val="false"/>
+          <w:i w:val="false"/>
+          <w:color w:val="334155"/>
+          <w:sz w:val="20"/>
+        </w:rPr>
+        <w:t>14</w:t>
+      </w:r>
+      <w:r>
+        <w:rPr>
+          <w:rFonts w:ascii="Yu Gothic" w:hAnsi="Yu Gothic" w:eastAsia="Yu Gothic"/>
+          <w:b w:val="false"/>
+          <w:i w:val="false"/>
+          <w:color w:val="334155"/>
+          <w:sz w:val="20"/>
+        </w:rPr>
+        <w:t>次元の特徴量を定義（</w:t>
+      </w:r>
+      <w:r>
+        <w:rPr>
+          <w:rFonts w:eastAsia="Yu Gothic" w:ascii="Yu Gothic" w:hAnsi="Yu Gothic"/>
+          <w:b w:val="false"/>
+          <w:i w:val="false"/>
+          <w:color w:val="334155"/>
+          <w:sz w:val="20"/>
+        </w:rPr>
+        <w:t>Step 6-2</w:t>
+      </w:r>
+      <w:r>
+        <w:rPr>
+          <w:rFonts w:ascii="Yu Gothic" w:hAnsi="Yu Gothic" w:eastAsia="Yu Gothic"/>
+          <w:b w:val="false"/>
+          <w:i w:val="false"/>
+          <w:color w:val="334155"/>
+          <w:sz w:val="20"/>
+        </w:rPr>
+        <w:t>でさらに洗練）。</w:t>
+      </w:r>
+    </w:p>
+    <w:p>
+      <w:pPr>
+        <w:pStyle w:val="ListBullet"/>
+        <w:numPr>
+          <w:ilvl w:val="0"/>
+          <w:numId w:val="1"/>
+        </w:numPr>
+        <w:spacing w:lineRule="auto" w:line="300" w:before="20" w:after="60"/>
+        <w:ind w:left="720" w:hanging="360"/>
+        <w:contextualSpacing/>
+        <w:rPr/>
+      </w:pPr>
+      <w:r>
+        <w:rPr>
+          <w:rFonts w:ascii="Yu Gothic" w:hAnsi="Yu Gothic" w:eastAsia="Yu Gothic"/>
+          <w:b/>
+          <w:i w:val="false"/>
+          <w:color w:val="0F172A"/>
+          <w:sz w:val="20"/>
+        </w:rPr>
+        <w:t xml:space="preserve">・極座標幾何 </w:t>
+      </w:r>
+      <w:r>
+        <w:rPr>
+          <w:rFonts w:eastAsia="Yu Gothic" w:ascii="Yu Gothic" w:hAnsi="Yu Gothic"/>
+          <w:b/>
+          <w:i w:val="false"/>
+          <w:color w:val="0F172A"/>
+          <w:sz w:val="20"/>
+        </w:rPr>
+        <w:t>(2</w:t>
+      </w:r>
+      <w:r>
+        <w:rPr>
+          <w:rFonts w:ascii="Yu Gothic" w:hAnsi="Yu Gothic" w:eastAsia="Yu Gothic"/>
+          <w:b/>
+          <w:i w:val="false"/>
+          <w:color w:val="0F172A"/>
+          <w:sz w:val="20"/>
+        </w:rPr>
+        <w:t>次元</w:t>
+      </w:r>
+      <w:r>
+        <w:rPr>
+          <w:rFonts w:eastAsia="Yu Gothic" w:ascii="Yu Gothic" w:hAnsi="Yu Gothic"/>
+          <w:b/>
+          <w:i w:val="false"/>
+          <w:color w:val="0F172A"/>
+          <w:sz w:val="20"/>
+        </w:rPr>
+        <w:t xml:space="preserve">): </w:t>
+      </w:r>
+      <w:r>
+        <w:rPr>
+          <w:rFonts w:ascii="Yu Gothic" w:hAnsi="Yu Gothic" w:eastAsia="Yu Gothic"/>
+          <w:b w:val="false"/>
+          <w:i w:val="false"/>
+          <w:color w:val="334155"/>
+          <w:sz w:val="20"/>
+        </w:rPr>
+        <w:t xml:space="preserve">半径 </w:t>
+      </w:r>
+      <w:r>
+        <w:rPr>
+          <w:rFonts w:eastAsia="Yu Gothic" w:ascii="Yu Gothic" w:hAnsi="Yu Gothic"/>
+          <w:b w:val="false"/>
+          <w:i w:val="false"/>
+          <w:color w:val="334155"/>
+          <w:sz w:val="20"/>
+        </w:rPr>
+        <w:t xml:space="preserve">r, </w:t>
+      </w:r>
+      <w:r>
+        <w:rPr>
+          <w:rFonts w:ascii="Yu Gothic" w:hAnsi="Yu Gothic" w:eastAsia="Yu Gothic"/>
+          <w:b w:val="false"/>
+          <w:i w:val="false"/>
+          <w:color w:val="334155"/>
+          <w:sz w:val="20"/>
+        </w:rPr>
+        <w:t xml:space="preserve">旋回角 </w:t>
+      </w:r>
+      <w:r>
+        <w:rPr>
+          <w:rFonts w:eastAsia="Yu Gothic" w:ascii="Yu Gothic" w:hAnsi="Yu Gothic"/>
+          <w:b w:val="false"/>
+          <w:i w:val="false"/>
+          <w:color w:val="334155"/>
+          <w:sz w:val="20"/>
+        </w:rPr>
+        <w:t>theta</w:t>
+      </w:r>
+      <w:r>
+        <w:rPr>
+          <w:rFonts w:ascii="Yu Gothic" w:hAnsi="Yu Gothic" w:eastAsia="Yu Gothic"/>
+          <w:b w:val="false"/>
+          <w:i w:val="false"/>
+          <w:color w:val="334155"/>
+          <w:sz w:val="20"/>
+        </w:rPr>
+        <w:t>（アームの旋回</w:t>
+      </w:r>
+      <w:r>
+        <w:rPr>
+          <w:rFonts w:eastAsia="Yu Gothic" w:ascii="Yu Gothic" w:hAnsi="Yu Gothic"/>
+          <w:b w:val="false"/>
+          <w:i w:val="false"/>
+          <w:color w:val="334155"/>
+          <w:sz w:val="20"/>
+        </w:rPr>
+        <w:t>J1</w:t>
+      </w:r>
+      <w:r>
+        <w:rPr>
+          <w:rFonts w:ascii="Yu Gothic" w:hAnsi="Yu Gothic" w:eastAsia="Yu Gothic"/>
+          <w:b w:val="false"/>
+          <w:i w:val="false"/>
+          <w:color w:val="334155"/>
+          <w:sz w:val="20"/>
+        </w:rPr>
+        <w:t>と腕の伸びに直結し、逆運動学の計算負担を軽減）</w:t>
+      </w:r>
+    </w:p>
+    <w:p>
+      <w:pPr>
+        <w:pStyle w:val="ListBullet"/>
+        <w:numPr>
+          <w:ilvl w:val="0"/>
+          <w:numId w:val="1"/>
+        </w:numPr>
+        <w:spacing w:lineRule="auto" w:line="300" w:before="20" w:after="60"/>
+        <w:ind w:left="720" w:hanging="360"/>
+        <w:contextualSpacing/>
+        <w:rPr/>
+      </w:pPr>
+      <w:r>
+        <w:rPr>
+          <w:rFonts w:ascii="Yu Gothic" w:hAnsi="Yu Gothic" w:eastAsia="Yu Gothic"/>
+          <w:b/>
+          <w:i w:val="false"/>
+          <w:color w:val="0F172A"/>
+          <w:sz w:val="20"/>
+        </w:rPr>
+        <w:t xml:space="preserve">・直交座標・相対変位 </w:t>
+      </w:r>
+      <w:r>
+        <w:rPr>
+          <w:rFonts w:eastAsia="Yu Gothic" w:ascii="Yu Gothic" w:hAnsi="Yu Gothic"/>
+          <w:b/>
+          <w:i w:val="false"/>
+          <w:color w:val="0F172A"/>
+          <w:sz w:val="20"/>
+        </w:rPr>
+        <w:t>(8</w:t>
+      </w:r>
+      <w:r>
+        <w:rPr>
+          <w:rFonts w:ascii="Yu Gothic" w:hAnsi="Yu Gothic" w:eastAsia="Yu Gothic"/>
+          <w:b/>
+          <w:i w:val="false"/>
+          <w:color w:val="0F172A"/>
+          <w:sz w:val="20"/>
+        </w:rPr>
+        <w:t>次元</w:t>
+      </w:r>
+      <w:r>
+        <w:rPr>
+          <w:rFonts w:eastAsia="Yu Gothic" w:ascii="Yu Gothic" w:hAnsi="Yu Gothic"/>
+          <w:b/>
+          <w:i w:val="false"/>
+          <w:color w:val="0F172A"/>
+          <w:sz w:val="20"/>
+        </w:rPr>
+        <w:t xml:space="preserve">): </w:t>
+      </w:r>
+      <w:r>
+        <w:rPr>
+          <w:rFonts w:ascii="Yu Gothic" w:hAnsi="Yu Gothic" w:eastAsia="Yu Gothic"/>
+          <w:b w:val="false"/>
+          <w:i w:val="false"/>
+          <w:color w:val="334155"/>
+          <w:sz w:val="20"/>
+        </w:rPr>
+        <w:t xml:space="preserve">ペグ位置 </w:t>
+      </w:r>
+      <w:r>
+        <w:rPr>
+          <w:rFonts w:eastAsia="Yu Gothic" w:ascii="Yu Gothic" w:hAnsi="Yu Gothic"/>
+          <w:b w:val="false"/>
+          <w:i w:val="false"/>
+          <w:color w:val="334155"/>
+          <w:sz w:val="20"/>
+        </w:rPr>
+        <w:t>(X, Y)</w:t>
+      </w:r>
+      <w:r>
+        <w:rPr>
+          <w:rFonts w:ascii="Yu Gothic" w:hAnsi="Yu Gothic" w:eastAsia="Yu Gothic"/>
+          <w:b w:val="false"/>
+          <w:i w:val="false"/>
+          <w:color w:val="334155"/>
+          <w:sz w:val="20"/>
+        </w:rPr>
+        <w:t xml:space="preserve">、穴位置 </w:t>
+      </w:r>
+      <w:r>
+        <w:rPr>
+          <w:rFonts w:eastAsia="Yu Gothic" w:ascii="Yu Gothic" w:hAnsi="Yu Gothic"/>
+          <w:b w:val="false"/>
+          <w:i w:val="false"/>
+          <w:color w:val="334155"/>
+          <w:sz w:val="20"/>
+        </w:rPr>
+        <w:t>(X, Y)</w:t>
+      </w:r>
+      <w:r>
+        <w:rPr>
+          <w:rFonts w:ascii="Yu Gothic" w:hAnsi="Yu Gothic" w:eastAsia="Yu Gothic"/>
+          <w:b w:val="false"/>
+          <w:i w:val="false"/>
+          <w:color w:val="334155"/>
+          <w:sz w:val="20"/>
+        </w:rPr>
+        <w:t xml:space="preserve">、相対差分 </w:t>
+      </w:r>
+      <w:r>
+        <w:rPr>
+          <w:rFonts w:eastAsia="Yu Gothic" w:ascii="Yu Gothic" w:hAnsi="Yu Gothic"/>
+          <w:b w:val="false"/>
+          <w:i w:val="false"/>
+          <w:color w:val="334155"/>
+          <w:sz w:val="20"/>
+        </w:rPr>
+        <w:t>(dX, dY)</w:t>
+      </w:r>
+      <w:r>
+        <w:rPr>
+          <w:rFonts w:ascii="Yu Gothic" w:hAnsi="Yu Gothic" w:eastAsia="Yu Gothic"/>
+          <w:b w:val="false"/>
+          <w:i w:val="false"/>
+          <w:color w:val="334155"/>
+          <w:sz w:val="20"/>
+        </w:rPr>
+        <w:t>、直線距離（ゴールへの方向と残り距離）</w:t>
+      </w:r>
+    </w:p>
+    <w:p>
+      <w:pPr>
+        <w:pStyle w:val="ListBullet"/>
+        <w:numPr>
+          <w:ilvl w:val="0"/>
+          <w:numId w:val="1"/>
+        </w:numPr>
+        <w:spacing w:lineRule="auto" w:line="300" w:before="20" w:after="60"/>
+        <w:ind w:left="720" w:hanging="360"/>
+        <w:contextualSpacing/>
+        <w:rPr/>
+      </w:pPr>
+      <w:r>
+        <w:rPr>
+          <w:rFonts w:ascii="Yu Gothic" w:hAnsi="Yu Gothic" w:eastAsia="Yu Gothic"/>
+          <w:b/>
+          <w:i w:val="false"/>
+          <w:color w:val="0F172A"/>
+          <w:sz w:val="20"/>
+        </w:rPr>
+        <w:t xml:space="preserve">・時間進行・動作フェーズ </w:t>
+      </w:r>
+      <w:r>
+        <w:rPr>
+          <w:rFonts w:eastAsia="Yu Gothic" w:ascii="Yu Gothic" w:hAnsi="Yu Gothic"/>
+          <w:b/>
+          <w:i w:val="false"/>
+          <w:color w:val="0F172A"/>
+          <w:sz w:val="20"/>
+        </w:rPr>
+        <w:t>(2</w:t>
+      </w:r>
+      <w:r>
+        <w:rPr>
+          <w:rFonts w:ascii="Yu Gothic" w:hAnsi="Yu Gothic" w:eastAsia="Yu Gothic"/>
+          <w:b/>
+          <w:i w:val="false"/>
+          <w:color w:val="0F172A"/>
+          <w:sz w:val="20"/>
+        </w:rPr>
+        <w:t>次元</w:t>
+      </w:r>
+      <w:r>
+        <w:rPr>
+          <w:rFonts w:eastAsia="Yu Gothic" w:ascii="Yu Gothic" w:hAnsi="Yu Gothic"/>
+          <w:b/>
+          <w:i w:val="false"/>
+          <w:color w:val="0F172A"/>
+          <w:sz w:val="20"/>
+        </w:rPr>
+        <w:t xml:space="preserve">): </w:t>
+      </w:r>
+      <w:r>
+        <w:rPr>
+          <w:rFonts w:ascii="Yu Gothic" w:hAnsi="Yu Gothic" w:eastAsia="Yu Gothic"/>
+          <w:b w:val="false"/>
+          <w:i w:val="false"/>
+          <w:color w:val="334155"/>
+          <w:sz w:val="20"/>
+        </w:rPr>
+        <w:t xml:space="preserve">進行度 </w:t>
+      </w:r>
+      <w:r>
+        <w:rPr>
+          <w:rFonts w:eastAsia="Yu Gothic" w:ascii="Yu Gothic" w:hAnsi="Yu Gothic"/>
+          <w:b w:val="false"/>
+          <w:i w:val="false"/>
+          <w:color w:val="334155"/>
+          <w:sz w:val="20"/>
+        </w:rPr>
+        <w:t>tau</w:t>
+      </w:r>
+      <w:r>
+        <w:rPr>
+          <w:rFonts w:ascii="Yu Gothic" w:hAnsi="Yu Gothic" w:eastAsia="Yu Gothic"/>
+          <w:b w:val="false"/>
+          <w:i w:val="false"/>
+          <w:color w:val="334155"/>
+          <w:sz w:val="20"/>
+        </w:rPr>
+        <w:t>、物理動作フェーズ（接近・把持・浮上・巡航・圧入・解放の現在地）</w:t>
+      </w:r>
+    </w:p>
+    <w:p>
+      <w:pPr>
+        <w:pStyle w:val="ListBullet"/>
+        <w:numPr>
+          <w:ilvl w:val="0"/>
+          <w:numId w:val="1"/>
+        </w:numPr>
+        <w:spacing w:lineRule="auto" w:line="300" w:before="20" w:after="60"/>
+        <w:ind w:left="720" w:hanging="360"/>
+        <w:contextualSpacing/>
+        <w:rPr/>
+      </w:pPr>
+      <w:r>
+        <w:rPr>
+          <w:rFonts w:ascii="Yu Gothic" w:hAnsi="Yu Gothic" w:eastAsia="Yu Gothic"/>
+          <w:b/>
+          <w:i w:val="false"/>
+          <w:color w:val="0F172A"/>
+          <w:sz w:val="20"/>
+        </w:rPr>
+        <w:t xml:space="preserve">・把持・浮上状態フラグ </w:t>
+      </w:r>
+      <w:r>
+        <w:rPr>
+          <w:rFonts w:eastAsia="Yu Gothic" w:ascii="Yu Gothic" w:hAnsi="Yu Gothic"/>
+          <w:b/>
+          <w:i w:val="false"/>
+          <w:color w:val="0F172A"/>
+          <w:sz w:val="20"/>
+        </w:rPr>
+        <w:t>(2</w:t>
+      </w:r>
+      <w:r>
+        <w:rPr>
+          <w:rFonts w:ascii="Yu Gothic" w:hAnsi="Yu Gothic" w:eastAsia="Yu Gothic"/>
+          <w:b/>
+          <w:i w:val="false"/>
+          <w:color w:val="0F172A"/>
+          <w:sz w:val="20"/>
+        </w:rPr>
+        <w:t>次元</w:t>
+      </w:r>
+      <w:r>
+        <w:rPr>
+          <w:rFonts w:eastAsia="Yu Gothic" w:ascii="Yu Gothic" w:hAnsi="Yu Gothic"/>
+          <w:b/>
+          <w:i w:val="false"/>
+          <w:color w:val="0F172A"/>
+          <w:sz w:val="20"/>
+        </w:rPr>
+        <w:t xml:space="preserve">): </w:t>
+      </w:r>
+      <w:r>
+        <w:rPr>
+          <w:rFonts w:ascii="Yu Gothic" w:hAnsi="Yu Gothic" w:eastAsia="Yu Gothic"/>
+          <w:b w:val="false"/>
+          <w:i w:val="false"/>
+          <w:color w:val="334155"/>
+          <w:sz w:val="20"/>
+        </w:rPr>
+        <w:t>把持状態フラグ、</w:t>
+      </w:r>
+      <w:r>
+        <w:rPr>
+          <w:rFonts w:eastAsia="Yu Gothic" w:ascii="Yu Gothic" w:hAnsi="Yu Gothic"/>
+          <w:b w:val="false"/>
+          <w:i w:val="false"/>
+          <w:color w:val="334155"/>
+          <w:sz w:val="20"/>
+        </w:rPr>
+        <w:t>Side</w:t>
+      </w:r>
+      <w:r>
+        <w:rPr>
+          <w:rFonts w:ascii="Yu Gothic" w:hAnsi="Yu Gothic" w:eastAsia="Yu Gothic"/>
+          <w:b w:val="false"/>
+          <w:i w:val="false"/>
+          <w:color w:val="334155"/>
+          <w:sz w:val="20"/>
+        </w:rPr>
+        <w:t>カメラ浮上完了フラグ（把持完了と安全浮上の確認）</w:t>
       </w:r>
     </w:p>
     <w:p>
@@ -3106,23 +3601,279 @@
       </w:pPr>
       <w:r>
         <w:rPr>
-          <w:rFonts w:eastAsia="Yu Gothic" w:ascii="Yu Gothic" w:hAnsi="Yu Gothic"/>
+          <w:rFonts w:ascii="Yu Gothic" w:hAnsi="Yu Gothic" w:eastAsia="Yu Gothic"/>
           <w:b/>
           <w:i w:val="false"/>
           <w:color w:val="0F172A"/>
           <w:sz w:val="20"/>
         </w:rPr>
-        <w:t>14</w:t>
-      </w:r>
-      <w:r>
-        <w:rPr>
-          <w:rFonts w:ascii="Yu Gothic" w:hAnsi="Yu Gothic" w:eastAsia="Yu Gothic"/>
+        <w:t>統計的正規化</w:t>
+      </w:r>
+      <w:r>
+        <w:rPr>
+          <w:rFonts w:eastAsia="Yu Gothic" w:ascii="Yu Gothic" w:hAnsi="Yu Gothic"/>
           <w:b/>
           <w:i w:val="false"/>
           <w:color w:val="0F172A"/>
           <w:sz w:val="20"/>
         </w:rPr>
-        <w:t>次元物理アフォーダンス特徴量ベクトルの定義</w:t>
+        <w:t xml:space="preserve">: </w:t>
+      </w:r>
+      <w:r>
+        <w:rPr>
+          <w:rFonts w:ascii="Yu Gothic" w:hAnsi="Yu Gothic" w:eastAsia="Yu Gothic"/>
+          <w:b w:val="false"/>
+          <w:i w:val="false"/>
+          <w:color w:val="334155"/>
+          <w:sz w:val="20"/>
+        </w:rPr>
+        <w:t>データセット全体から平均値と標準偏差を算出して正規化（</w:t>
+      </w:r>
+      <w:r>
+        <w:rPr>
+          <w:rFonts w:eastAsia="Yu Gothic" w:ascii="Yu Gothic" w:hAnsi="Yu Gothic"/>
+          <w:b w:val="false"/>
+          <w:i w:val="false"/>
+          <w:color w:val="334155"/>
+          <w:sz w:val="20"/>
+        </w:rPr>
+        <w:t>Z-score</w:t>
+      </w:r>
+      <w:r>
+        <w:rPr>
+          <w:rFonts w:ascii="Yu Gothic" w:hAnsi="Yu Gothic" w:eastAsia="Yu Gothic"/>
+          <w:b w:val="false"/>
+          <w:i w:val="false"/>
+          <w:color w:val="334155"/>
+          <w:sz w:val="20"/>
+        </w:rPr>
+        <w:t>）を適用し、学習が安定するように下限ガード処理を導入。</w:t>
+      </w:r>
+    </w:p>
+    <w:p>
+      <w:pPr>
+        <w:pStyle w:val="Heading1"/>
+        <w:spacing w:before="280" w:after="120"/>
+        <w:rPr/>
+      </w:pPr>
+      <w:r>
+        <w:rPr>
+          <w:rFonts w:eastAsia="Yu Gothic" w:ascii="Yu Gothic" w:hAnsi="Yu Gothic"/>
+          <w:b/>
+          <w:i w:val="false"/>
+          <w:color w:val="1E3A8A"/>
+          <w:sz w:val="28"/>
+        </w:rPr>
+        <w:t xml:space="preserve">5. Step 4: </w:t>
+      </w:r>
+      <w:r>
+        <w:rPr>
+          <w:rFonts w:ascii="Yu Gothic" w:hAnsi="Yu Gothic" w:eastAsia="Yu Gothic"/>
+          <w:b/>
+          <w:i w:val="false"/>
+          <w:color w:val="1E3A8A"/>
+          <w:sz w:val="28"/>
+        </w:rPr>
+        <w:t xml:space="preserve">初期模倣学習 </w:t>
+      </w:r>
+      <w:r>
+        <w:rPr>
+          <w:rFonts w:eastAsia="Yu Gothic" w:ascii="Yu Gothic" w:hAnsi="Yu Gothic"/>
+          <w:b/>
+          <w:i w:val="false"/>
+          <w:color w:val="1E3A8A"/>
+          <w:sz w:val="28"/>
+        </w:rPr>
+        <w:t xml:space="preserve">(ACT) </w:t>
+      </w:r>
+      <w:r>
+        <w:rPr>
+          <w:rFonts w:ascii="Yu Gothic" w:hAnsi="Yu Gothic" w:eastAsia="Yu Gothic"/>
+          <w:b/>
+          <w:i w:val="false"/>
+          <w:color w:val="1E3A8A"/>
+          <w:sz w:val="28"/>
+        </w:rPr>
+        <w:t>＆ 人手データの限界</w:t>
+      </w:r>
+    </w:p>
+    <w:p>
+      <w:pPr>
+        <w:pStyle w:val="ListBullet"/>
+        <w:numPr>
+          <w:ilvl w:val="0"/>
+          <w:numId w:val="1"/>
+        </w:numPr>
+        <w:spacing w:lineRule="auto" w:line="300" w:before="20" w:after="60"/>
+        <w:ind w:left="360" w:hanging="360"/>
+        <w:contextualSpacing/>
+        <w:rPr/>
+      </w:pPr>
+      <w:r>
+        <w:rPr>
+          <w:rFonts w:ascii="Yu Gothic" w:hAnsi="Yu Gothic" w:eastAsia="Yu Gothic"/>
+          <w:b/>
+          <w:i w:val="false"/>
+          <w:color w:val="0F172A"/>
+          <w:sz w:val="20"/>
+        </w:rPr>
+        <w:t>目的</w:t>
+      </w:r>
+      <w:r>
+        <w:rPr>
+          <w:rFonts w:eastAsia="Yu Gothic" w:ascii="Yu Gothic" w:hAnsi="Yu Gothic"/>
+          <w:b/>
+          <w:i w:val="false"/>
+          <w:color w:val="0F172A"/>
+          <w:sz w:val="20"/>
+        </w:rPr>
+        <w:t xml:space="preserve">: </w:t>
+      </w:r>
+      <w:r>
+        <w:rPr>
+          <w:rFonts w:ascii="Yu Gothic" w:hAnsi="Yu Gothic" w:eastAsia="Yu Gothic"/>
+          <w:b w:val="false"/>
+          <w:i w:val="false"/>
+          <w:color w:val="334155"/>
+          <w:sz w:val="20"/>
+        </w:rPr>
+        <w:t>人手収集データに基づく初期模倣学習モデル（</w:t>
+      </w:r>
+      <w:r>
+        <w:rPr>
+          <w:rFonts w:eastAsia="Yu Gothic" w:ascii="Yu Gothic" w:hAnsi="Yu Gothic"/>
+          <w:b w:val="false"/>
+          <w:i w:val="false"/>
+          <w:color w:val="334155"/>
+          <w:sz w:val="20"/>
+        </w:rPr>
+        <w:t>Action Chunking with Transformers: ACT</w:t>
+      </w:r>
+      <w:r>
+        <w:rPr>
+          <w:rFonts w:ascii="Yu Gothic" w:hAnsi="Yu Gothic" w:eastAsia="Yu Gothic"/>
+          <w:b w:val="false"/>
+          <w:i w:val="false"/>
+          <w:color w:val="334155"/>
+          <w:sz w:val="20"/>
+        </w:rPr>
+        <w:t>）を構築し、自律実行性能および限界要因を特定。</w:t>
+      </w:r>
+    </w:p>
+    <w:p>
+      <w:pPr>
+        <w:pStyle w:val="ListBullet"/>
+        <w:numPr>
+          <w:ilvl w:val="0"/>
+          <w:numId w:val="1"/>
+        </w:numPr>
+        <w:spacing w:lineRule="auto" w:line="300" w:before="20" w:after="60"/>
+        <w:ind w:left="360" w:hanging="360"/>
+        <w:contextualSpacing/>
+        <w:rPr/>
+      </w:pPr>
+      <w:r>
+        <w:rPr>
+          <w:rFonts w:ascii="Yu Gothic" w:hAnsi="Yu Gothic" w:eastAsia="Yu Gothic"/>
+          <w:b/>
+          <w:i w:val="false"/>
+          <w:color w:val="0F172A"/>
+          <w:sz w:val="20"/>
+        </w:rPr>
+        <w:t>モデル構造</w:t>
+      </w:r>
+      <w:r>
+        <w:rPr>
+          <w:rFonts w:eastAsia="Yu Gothic" w:ascii="Yu Gothic" w:hAnsi="Yu Gothic"/>
+          <w:b/>
+          <w:i w:val="false"/>
+          <w:color w:val="0F172A"/>
+          <w:sz w:val="20"/>
+        </w:rPr>
+        <w:t xml:space="preserve">: </w:t>
+      </w:r>
+      <w:r>
+        <w:rPr>
+          <w:rFonts w:eastAsia="Yu Gothic" w:ascii="Yu Gothic" w:hAnsi="Yu Gothic"/>
+          <w:b w:val="false"/>
+          <w:i w:val="false"/>
+          <w:color w:val="334155"/>
+          <w:sz w:val="20"/>
+        </w:rPr>
+        <w:t xml:space="preserve">ResNet-18 </w:t>
+      </w:r>
+      <w:r>
+        <w:rPr>
+          <w:rFonts w:ascii="Yu Gothic" w:hAnsi="Yu Gothic" w:eastAsia="Yu Gothic"/>
+          <w:b w:val="false"/>
+          <w:i w:val="false"/>
+          <w:color w:val="334155"/>
+          <w:sz w:val="20"/>
+        </w:rPr>
+        <w:t xml:space="preserve">バックボーンによる双眼画像特徴抽出器 ＋ </w:t>
+      </w:r>
+      <w:r>
+        <w:rPr>
+          <w:rFonts w:eastAsia="Yu Gothic" w:ascii="Yu Gothic" w:hAnsi="Yu Gothic"/>
+          <w:b w:val="false"/>
+          <w:i w:val="false"/>
+          <w:color w:val="334155"/>
+          <w:sz w:val="20"/>
+        </w:rPr>
+        <w:t>CVAE</w:t>
+      </w:r>
+      <w:r>
+        <w:rPr>
+          <w:rFonts w:ascii="Yu Gothic" w:hAnsi="Yu Gothic" w:eastAsia="Yu Gothic"/>
+          <w:b w:val="false"/>
+          <w:i w:val="false"/>
+          <w:color w:val="334155"/>
+          <w:sz w:val="20"/>
+        </w:rPr>
+        <w:t>（</w:t>
+      </w:r>
+      <w:r>
+        <w:rPr>
+          <w:rFonts w:eastAsia="Yu Gothic" w:ascii="Yu Gothic" w:hAnsi="Yu Gothic"/>
+          <w:b w:val="false"/>
+          <w:i w:val="false"/>
+          <w:color w:val="334155"/>
+          <w:sz w:val="20"/>
+        </w:rPr>
+        <w:t>Conditional Variational Autoencoder</w:t>
+      </w:r>
+      <w:r>
+        <w:rPr>
+          <w:rFonts w:ascii="Yu Gothic" w:hAnsi="Yu Gothic" w:eastAsia="Yu Gothic"/>
+          <w:b w:val="false"/>
+          <w:i w:val="false"/>
+          <w:color w:val="334155"/>
+          <w:sz w:val="20"/>
+        </w:rPr>
+        <w:t>）によるマルチモーダル軌道生成器。</w:t>
+      </w:r>
+    </w:p>
+    <w:p>
+      <w:pPr>
+        <w:pStyle w:val="ListBullet"/>
+        <w:numPr>
+          <w:ilvl w:val="0"/>
+          <w:numId w:val="1"/>
+        </w:numPr>
+        <w:spacing w:lineRule="auto" w:line="300" w:before="20" w:after="60"/>
+        <w:ind w:left="360" w:hanging="360"/>
+        <w:contextualSpacing/>
+        <w:rPr/>
+      </w:pPr>
+      <w:r>
+        <w:rPr>
+          <w:rFonts w:ascii="Yu Gothic" w:hAnsi="Yu Gothic" w:eastAsia="Yu Gothic"/>
+          <w:b/>
+          <w:i w:val="false"/>
+          <w:color w:val="0F172A"/>
+          <w:sz w:val="20"/>
+        </w:rPr>
+        <w:t>露呈した課題と技術的ボトルネック</w:t>
       </w:r>
       <w:r>
         <w:rPr>
@@ -3155,7 +3906,7 @@
           <w:color w:val="0F172A"/>
           <w:sz w:val="20"/>
         </w:rPr>
-        <w:t xml:space="preserve">・関節現在角 </w:t>
+        <w:t xml:space="preserve">・推論誤差の積み重なり（複合誤差 </w:t>
       </w:r>
       <w:r>
         <w:rPr>
@@ -3165,7 +3916,7 @@
           <w:color w:val="0F172A"/>
           <w:sz w:val="20"/>
         </w:rPr>
-        <w:t>(4</w:t>
+        <w:t>/ Covariate Shift</w:t>
       </w:r>
       <w:r>
         <w:rPr>
@@ -3175,7 +3926,7 @@
           <w:color w:val="0F172A"/>
           <w:sz w:val="20"/>
         </w:rPr>
-        <w:t>次元</w:t>
+        <w:t>）</w:t>
       </w:r>
       <w:r>
         <w:rPr>
@@ -3185,117 +3936,17 @@
           <w:color w:val="0F172A"/>
           <w:sz w:val="20"/>
         </w:rPr>
-        <w:t xml:space="preserve">): </w:t>
-      </w:r>
-      <w:r>
-        <w:rPr>
-          <w:rFonts w:eastAsia="Yu Gothic" w:ascii="Yu Gothic" w:hAnsi="Yu Gothic"/>
-          <w:b w:val="false"/>
-          <w:i w:val="false"/>
-          <w:color w:val="334155"/>
-          <w:sz w:val="20"/>
-        </w:rPr>
-        <w:t>joint1 (</w:t>
-      </w:r>
-      <w:r>
-        <w:rPr>
-          <w:rFonts w:ascii="Yu Gothic" w:hAnsi="Yu Gothic" w:eastAsia="Yu Gothic"/>
-          <w:b w:val="false"/>
-          <w:i w:val="false"/>
-          <w:color w:val="334155"/>
-          <w:sz w:val="20"/>
-        </w:rPr>
-        <w:t>旋回</w:t>
-      </w:r>
-      <w:r>
-        <w:rPr>
-          <w:rFonts w:eastAsia="Yu Gothic" w:ascii="Yu Gothic" w:hAnsi="Yu Gothic"/>
-          <w:b w:val="false"/>
-          <w:i w:val="false"/>
-          <w:color w:val="334155"/>
-          <w:sz w:val="20"/>
-        </w:rPr>
-        <w:t>), joint2 (</w:t>
-      </w:r>
-      <w:r>
-        <w:rPr>
-          <w:rFonts w:ascii="Yu Gothic" w:hAnsi="Yu Gothic" w:eastAsia="Yu Gothic"/>
-          <w:b w:val="false"/>
-          <w:i w:val="false"/>
-          <w:color w:val="334155"/>
-          <w:sz w:val="20"/>
-        </w:rPr>
-        <w:t>肩</w:t>
-      </w:r>
-      <w:r>
-        <w:rPr>
-          <w:rFonts w:eastAsia="Yu Gothic" w:ascii="Yu Gothic" w:hAnsi="Yu Gothic"/>
-          <w:b w:val="false"/>
-          <w:i w:val="false"/>
-          <w:color w:val="334155"/>
-          <w:sz w:val="20"/>
-        </w:rPr>
-        <w:t>), joint3 (</w:t>
-      </w:r>
-      <w:r>
-        <w:rPr>
-          <w:rFonts w:ascii="Yu Gothic" w:hAnsi="Yu Gothic" w:eastAsia="Yu Gothic"/>
-          <w:b w:val="false"/>
-          <w:i w:val="false"/>
-          <w:color w:val="334155"/>
-          <w:sz w:val="20"/>
-        </w:rPr>
-        <w:t>肘</w:t>
-      </w:r>
-      <w:r>
-        <w:rPr>
-          <w:rFonts w:eastAsia="Yu Gothic" w:ascii="Yu Gothic" w:hAnsi="Yu Gothic"/>
-          <w:b w:val="false"/>
-          <w:i w:val="false"/>
-          <w:color w:val="334155"/>
-          <w:sz w:val="20"/>
-        </w:rPr>
-        <w:t>), joint4 (</w:t>
-      </w:r>
-      <w:r>
-        <w:rPr>
-          <w:rFonts w:ascii="Yu Gothic" w:hAnsi="Yu Gothic" w:eastAsia="Yu Gothic"/>
-          <w:b w:val="false"/>
-          <w:i w:val="false"/>
-          <w:color w:val="334155"/>
-          <w:sz w:val="20"/>
-        </w:rPr>
-        <w:t>手首ピッチ</w:t>
-      </w:r>
-      <w:r>
-        <w:rPr>
-          <w:rFonts w:eastAsia="Yu Gothic" w:ascii="Yu Gothic" w:hAnsi="Yu Gothic"/>
-          <w:b w:val="false"/>
-          <w:i w:val="false"/>
-          <w:color w:val="334155"/>
-          <w:sz w:val="20"/>
-        </w:rPr>
-        <w:t xml:space="preserve">) </w:t>
-      </w:r>
-      <w:r>
-        <w:rPr>
-          <w:rFonts w:ascii="Yu Gothic" w:hAnsi="Yu Gothic" w:eastAsia="Yu Gothic"/>
-          <w:b w:val="false"/>
-          <w:i w:val="false"/>
-          <w:color w:val="334155"/>
-          <w:sz w:val="20"/>
-        </w:rPr>
-        <w:t xml:space="preserve">の現在角度 </w:t>
-      </w:r>
-      <w:r>
-        <w:rPr>
-          <w:rFonts w:eastAsia="Yu Gothic" w:ascii="Yu Gothic" w:hAnsi="Yu Gothic"/>
-          <w:b w:val="false"/>
-          <w:i w:val="false"/>
-          <w:color w:val="334155"/>
-          <w:sz w:val="20"/>
-        </w:rPr>
-        <w:t>[rad]</w:t>
+        <w:t xml:space="preserve">: </w:t>
+      </w:r>
+      <w:r>
+        <w:rPr>
+          <w:rFonts w:ascii="Yu Gothic" w:hAnsi="Yu Gothic" w:eastAsia="Yu Gothic"/>
+          <w:b w:val="false"/>
+          <w:i w:val="false"/>
+          <w:color w:val="334155"/>
+          <w:sz w:val="20"/>
+        </w:rPr>
+        <w:t>ロボットが自分で推論しながら動く際、わずかなズレが次のステップでさらに拡大。一度でもペグの中心から外れると元の軌道に戻れず、失敗してしまいます。</w:t>
       </w:r>
     </w:p>
     <w:p>
@@ -3318,7 +3969,7 @@
           <w:color w:val="0F172A"/>
           <w:sz w:val="20"/>
         </w:rPr>
-        <w:t xml:space="preserve">・グリッパー状態 </w:t>
+        <w:t>・すきま</w:t>
       </w:r>
       <w:r>
         <w:rPr>
@@ -3328,7 +3979,7 @@
           <w:color w:val="0F172A"/>
           <w:sz w:val="20"/>
         </w:rPr>
-        <w:t>(1</w:t>
+        <w:t>2mm</w:t>
       </w:r>
       <w:r>
         <w:rPr>
@@ -3338,7 +3989,7 @@
           <w:color w:val="0F172A"/>
           <w:sz w:val="20"/>
         </w:rPr>
-        <w:t>次元</w:t>
+        <w:t>の物理干渉</w:t>
       </w:r>
       <w:r>
         <w:rPr>
@@ -3348,77 +3999,77 @@
           <w:color w:val="0F172A"/>
           <w:sz w:val="20"/>
         </w:rPr>
-        <w:t xml:space="preserve">): </w:t>
-      </w:r>
-      <w:r>
-        <w:rPr>
-          <w:rFonts w:eastAsia="Yu Gothic" w:ascii="Yu Gothic" w:hAnsi="Yu Gothic"/>
-          <w:b w:val="false"/>
-          <w:i w:val="false"/>
-          <w:color w:val="334155"/>
-          <w:sz w:val="20"/>
-        </w:rPr>
-        <w:t xml:space="preserve">finger_joint </w:t>
-      </w:r>
-      <w:r>
-        <w:rPr>
-          <w:rFonts w:ascii="Yu Gothic" w:hAnsi="Yu Gothic" w:eastAsia="Yu Gothic"/>
-          <w:b w:val="false"/>
-          <w:i w:val="false"/>
-          <w:color w:val="334155"/>
-          <w:sz w:val="20"/>
-        </w:rPr>
-        <w:t xml:space="preserve">開度 </w:t>
-      </w:r>
-      <w:r>
-        <w:rPr>
-          <w:rFonts w:eastAsia="Yu Gothic" w:ascii="Yu Gothic" w:hAnsi="Yu Gothic"/>
-          <w:b w:val="false"/>
-          <w:i w:val="false"/>
-          <w:color w:val="334155"/>
-          <w:sz w:val="20"/>
-        </w:rPr>
-        <w:t xml:space="preserve">(0.0: </w:t>
-      </w:r>
-      <w:r>
-        <w:rPr>
-          <w:rFonts w:ascii="Yu Gothic" w:hAnsi="Yu Gothic" w:eastAsia="Yu Gothic"/>
-          <w:b w:val="false"/>
-          <w:i w:val="false"/>
-          <w:color w:val="334155"/>
-          <w:sz w:val="20"/>
-        </w:rPr>
-        <w:t xml:space="preserve">完全閉 〜 </w:t>
-      </w:r>
-      <w:r>
-        <w:rPr>
-          <w:rFonts w:eastAsia="Yu Gothic" w:ascii="Yu Gothic" w:hAnsi="Yu Gothic"/>
-          <w:b w:val="false"/>
-          <w:i w:val="false"/>
-          <w:color w:val="334155"/>
-          <w:sz w:val="20"/>
-        </w:rPr>
-        <w:t xml:space="preserve">0.8: </w:t>
-      </w:r>
-      <w:r>
-        <w:rPr>
-          <w:rFonts w:ascii="Yu Gothic" w:hAnsi="Yu Gothic" w:eastAsia="Yu Gothic"/>
-          <w:b w:val="false"/>
-          <w:i w:val="false"/>
-          <w:color w:val="334155"/>
-          <w:sz w:val="20"/>
-        </w:rPr>
-        <w:t>完全開</w:t>
-      </w:r>
-      <w:r>
-        <w:rPr>
-          <w:rFonts w:eastAsia="Yu Gothic" w:ascii="Yu Gothic" w:hAnsi="Yu Gothic"/>
-          <w:b w:val="false"/>
-          <w:i w:val="false"/>
-          <w:color w:val="334155"/>
-          <w:sz w:val="20"/>
-        </w:rPr>
-        <w:t>)</w:t>
+        <w:t xml:space="preserve">: </w:t>
+      </w:r>
+      <w:r>
+        <w:rPr>
+          <w:rFonts w:ascii="Yu Gothic" w:hAnsi="Yu Gothic" w:eastAsia="Yu Gothic"/>
+          <w:b w:val="false"/>
+          <w:i w:val="false"/>
+          <w:color w:val="334155"/>
+          <w:sz w:val="20"/>
+        </w:rPr>
+        <w:t>クリアランスがわずか</w:t>
+      </w:r>
+      <w:r>
+        <w:rPr>
+          <w:rFonts w:eastAsia="Yu Gothic" w:ascii="Yu Gothic" w:hAnsi="Yu Gothic"/>
+          <w:b w:val="false"/>
+          <w:i w:val="false"/>
+          <w:color w:val="334155"/>
+          <w:sz w:val="20"/>
+        </w:rPr>
+        <w:t>2mm</w:t>
+      </w:r>
+      <w:r>
+        <w:rPr>
+          <w:rFonts w:ascii="Yu Gothic" w:hAnsi="Yu Gothic" w:eastAsia="Yu Gothic"/>
+          <w:b w:val="false"/>
+          <w:i w:val="false"/>
+          <w:color w:val="334155"/>
+          <w:sz w:val="20"/>
+        </w:rPr>
+        <w:t>しかないため、ペグが</w:t>
+      </w:r>
+      <w:r>
+        <w:rPr>
+          <w:rFonts w:eastAsia="Yu Gothic" w:ascii="Yu Gothic" w:hAnsi="Yu Gothic"/>
+          <w:b w:val="false"/>
+          <w:i w:val="false"/>
+          <w:color w:val="334155"/>
+          <w:sz w:val="20"/>
+        </w:rPr>
+        <w:t>2</w:t>
+      </w:r>
+      <w:r>
+        <w:rPr>
+          <w:rFonts w:ascii="Yu Gothic" w:hAnsi="Yu Gothic" w:eastAsia="Yu Gothic"/>
+          <w:b w:val="false"/>
+          <w:i w:val="false"/>
+          <w:color w:val="334155"/>
+          <w:sz w:val="20"/>
+        </w:rPr>
+        <w:t>〜</w:t>
+      </w:r>
+      <w:r>
+        <w:rPr>
+          <w:rFonts w:eastAsia="Yu Gothic" w:ascii="Yu Gothic" w:hAnsi="Yu Gothic"/>
+          <w:b w:val="false"/>
+          <w:i w:val="false"/>
+          <w:color w:val="334155"/>
+          <w:sz w:val="20"/>
+        </w:rPr>
+        <w:t>3</w:t>
+      </w:r>
+      <w:r>
+        <w:rPr>
+          <w:rFonts w:ascii="Yu Gothic" w:hAnsi="Yu Gothic" w:eastAsia="Yu Gothic"/>
+          <w:b w:val="false"/>
+          <w:i w:val="false"/>
+          <w:color w:val="334155"/>
+          <w:sz w:val="20"/>
+        </w:rPr>
+        <w:t>度傾くだけで穴の縁に引っかかって停止してしまいます。人間のお手本を真似るだけでは、この接触反力にうまく適応できませんでした。</w:t>
       </w:r>
     </w:p>
     <w:p>
@@ -3441,7 +4092,7 @@
           <w:color w:val="0F172A"/>
           <w:sz w:val="20"/>
         </w:rPr>
-        <w:t xml:space="preserve">・関節目標角速度 </w:t>
+        <w:t>・人手データ収集の限界</w:t>
       </w:r>
       <w:r>
         <w:rPr>
@@ -3451,182 +4102,6 @@
           <w:color w:val="0F172A"/>
           <w:sz w:val="20"/>
         </w:rPr>
-        <w:t>(4</w:t>
-      </w:r>
-      <w:r>
-        <w:rPr>
-          <w:rFonts w:ascii="Yu Gothic" w:hAnsi="Yu Gothic" w:eastAsia="Yu Gothic"/>
-          <w:b/>
-          <w:i w:val="false"/>
-          <w:color w:val="0F172A"/>
-          <w:sz w:val="20"/>
-        </w:rPr>
-        <w:t>次元</w:t>
-      </w:r>
-      <w:r>
-        <w:rPr>
-          <w:rFonts w:eastAsia="Yu Gothic" w:ascii="Yu Gothic" w:hAnsi="Yu Gothic"/>
-          <w:b/>
-          <w:i w:val="false"/>
-          <w:color w:val="0F172A"/>
-          <w:sz w:val="20"/>
-        </w:rPr>
-        <w:t xml:space="preserve">): </w:t>
-      </w:r>
-      <w:r>
-        <w:rPr>
-          <w:rFonts w:ascii="Yu Gothic" w:hAnsi="Yu Gothic" w:eastAsia="Yu Gothic"/>
-          <w:b w:val="false"/>
-          <w:i w:val="false"/>
-          <w:color w:val="334155"/>
-          <w:sz w:val="20"/>
-        </w:rPr>
-        <w:t xml:space="preserve">次ステップへの動的角速度指令値 </w:t>
-      </w:r>
-      <w:r>
-        <w:rPr>
-          <w:rFonts w:eastAsia="Yu Gothic" w:ascii="Yu Gothic" w:hAnsi="Yu Gothic"/>
-          <w:b w:val="false"/>
-          <w:i w:val="false"/>
-          <w:color w:val="334155"/>
-          <w:sz w:val="20"/>
-        </w:rPr>
-        <w:t>[rad/s]</w:t>
-      </w:r>
-    </w:p>
-    <w:p>
-      <w:pPr>
-        <w:pStyle w:val="ListBullet"/>
-        <w:numPr>
-          <w:ilvl w:val="0"/>
-          <w:numId w:val="1"/>
-        </w:numPr>
-        <w:spacing w:lineRule="auto" w:line="300" w:before="20" w:after="60"/>
-        <w:ind w:left="720" w:hanging="360"/>
-        <w:contextualSpacing/>
-        <w:rPr/>
-      </w:pPr>
-      <w:r>
-        <w:rPr>
-          <w:rFonts w:ascii="Yu Gothic" w:hAnsi="Yu Gothic" w:eastAsia="Yu Gothic"/>
-          <w:b/>
-          <w:i w:val="false"/>
-          <w:color w:val="0F172A"/>
-          <w:sz w:val="20"/>
-        </w:rPr>
-        <w:t xml:space="preserve">・空間アフォーダンス特徴 </w:t>
-      </w:r>
-      <w:r>
-        <w:rPr>
-          <w:rFonts w:eastAsia="Yu Gothic" w:ascii="Yu Gothic" w:hAnsi="Yu Gothic"/>
-          <w:b/>
-          <w:i w:val="false"/>
-          <w:color w:val="0F172A"/>
-          <w:sz w:val="20"/>
-        </w:rPr>
-        <w:t>(5</w:t>
-      </w:r>
-      <w:r>
-        <w:rPr>
-          <w:rFonts w:ascii="Yu Gothic" w:hAnsi="Yu Gothic" w:eastAsia="Yu Gothic"/>
-          <w:b/>
-          <w:i w:val="false"/>
-          <w:color w:val="0F172A"/>
-          <w:sz w:val="20"/>
-        </w:rPr>
-        <w:t>次元</w:t>
-      </w:r>
-      <w:r>
-        <w:rPr>
-          <w:rFonts w:eastAsia="Yu Gothic" w:ascii="Yu Gothic" w:hAnsi="Yu Gothic"/>
-          <w:b/>
-          <w:i w:val="false"/>
-          <w:color w:val="0F172A"/>
-          <w:sz w:val="20"/>
-        </w:rPr>
-        <w:t xml:space="preserve">): </w:t>
-      </w:r>
-      <w:r>
-        <w:rPr>
-          <w:rFonts w:ascii="Yu Gothic" w:hAnsi="Yu Gothic" w:eastAsia="Yu Gothic"/>
-          <w:b w:val="false"/>
-          <w:i w:val="false"/>
-          <w:color w:val="334155"/>
-          <w:sz w:val="20"/>
-        </w:rPr>
-        <w:t>ペグ推定</w:t>
-      </w:r>
-      <w:r>
-        <w:rPr>
-          <w:rFonts w:eastAsia="Yu Gothic" w:ascii="Yu Gothic" w:hAnsi="Yu Gothic"/>
-          <w:b w:val="false"/>
-          <w:i w:val="false"/>
-          <w:color w:val="334155"/>
-          <w:sz w:val="20"/>
-        </w:rPr>
-        <w:t>3D</w:t>
-      </w:r>
-      <w:r>
-        <w:rPr>
-          <w:rFonts w:ascii="Yu Gothic" w:hAnsi="Yu Gothic" w:eastAsia="Yu Gothic"/>
-          <w:b w:val="false"/>
-          <w:i w:val="false"/>
-          <w:color w:val="334155"/>
-          <w:sz w:val="20"/>
-        </w:rPr>
-        <w:t xml:space="preserve">相対位置 </w:t>
-      </w:r>
-      <w:r>
-        <w:rPr>
-          <w:rFonts w:eastAsia="Yu Gothic" w:ascii="Yu Gothic" w:hAnsi="Yu Gothic"/>
-          <w:b w:val="false"/>
-          <w:i w:val="false"/>
-          <w:color w:val="334155"/>
-          <w:sz w:val="20"/>
-        </w:rPr>
-        <w:t>(X, Y, Z)</w:t>
-      </w:r>
-      <w:r>
-        <w:rPr>
-          <w:rFonts w:ascii="Yu Gothic" w:hAnsi="Yu Gothic" w:eastAsia="Yu Gothic"/>
-          <w:b w:val="false"/>
-          <w:i w:val="false"/>
-          <w:color w:val="334155"/>
-          <w:sz w:val="20"/>
-        </w:rPr>
-        <w:t>、受台穴推定相対位置、物体把持判定フラグ</w:t>
-      </w:r>
-    </w:p>
-    <w:p>
-      <w:pPr>
-        <w:pStyle w:val="ListBullet"/>
-        <w:numPr>
-          <w:ilvl w:val="0"/>
-          <w:numId w:val="1"/>
-        </w:numPr>
-        <w:spacing w:lineRule="auto" w:line="300" w:before="20" w:after="60"/>
-        <w:ind w:left="360" w:hanging="360"/>
-        <w:contextualSpacing/>
-        <w:rPr/>
-      </w:pPr>
-      <w:r>
-        <w:rPr>
-          <w:rFonts w:ascii="Yu Gothic" w:hAnsi="Yu Gothic" w:eastAsia="Yu Gothic"/>
-          <w:b/>
-          <w:i w:val="false"/>
-          <w:color w:val="0F172A"/>
-          <w:sz w:val="20"/>
-        </w:rPr>
-        <w:t>統計的正規化</w:t>
-      </w:r>
-      <w:r>
-        <w:rPr>
-          <w:rFonts w:eastAsia="Yu Gothic" w:ascii="Yu Gothic" w:hAnsi="Yu Gothic"/>
-          <w:b/>
-          <w:i w:val="false"/>
-          <w:color w:val="0F172A"/>
-          <w:sz w:val="20"/>
-        </w:rPr>
         <w:t xml:space="preserve">: </w:t>
       </w:r>
       <w:r>
@@ -3637,479 +4112,17 @@
           <w:color w:val="334155"/>
           <w:sz w:val="20"/>
         </w:rPr>
-        <w:t xml:space="preserve">データセット全体から平均値ベクトル </w:t>
-      </w:r>
-      <w:r>
-        <w:rPr>
-          <w:rFonts w:eastAsia="Yu Gothic" w:ascii="Yu Gothic" w:hAnsi="Yu Gothic"/>
-          <w:b w:val="false"/>
-          <w:i w:val="false"/>
-          <w:color w:val="334155"/>
-          <w:sz w:val="20"/>
-        </w:rPr>
-        <w:t xml:space="preserve">mu </w:t>
-      </w:r>
-      <w:r>
-        <w:rPr>
-          <w:rFonts w:ascii="Yu Gothic" w:hAnsi="Yu Gothic" w:eastAsia="Yu Gothic"/>
-          <w:b w:val="false"/>
-          <w:i w:val="false"/>
-          <w:color w:val="334155"/>
-          <w:sz w:val="20"/>
-        </w:rPr>
-        <w:t xml:space="preserve">と標準偏差ベクトル </w:t>
-      </w:r>
-      <w:r>
-        <w:rPr>
-          <w:rFonts w:eastAsia="Yu Gothic" w:ascii="Yu Gothic" w:hAnsi="Yu Gothic"/>
-          <w:b w:val="false"/>
-          <w:i w:val="false"/>
-          <w:color w:val="334155"/>
-          <w:sz w:val="20"/>
-        </w:rPr>
-        <w:t xml:space="preserve">sigma </w:t>
-      </w:r>
-      <w:r>
-        <w:rPr>
-          <w:rFonts w:ascii="Yu Gothic" w:hAnsi="Yu Gothic" w:eastAsia="Yu Gothic"/>
-          <w:b w:val="false"/>
-          <w:i w:val="false"/>
-          <w:color w:val="334155"/>
-          <w:sz w:val="20"/>
-        </w:rPr>
-        <w:t>を算出し、</w:t>
-      </w:r>
-      <w:r>
-        <w:rPr>
-          <w:rFonts w:eastAsia="Yu Gothic" w:ascii="Yu Gothic" w:hAnsi="Yu Gothic"/>
-          <w:b w:val="false"/>
-          <w:i w:val="false"/>
-          <w:color w:val="334155"/>
-          <w:sz w:val="20"/>
-        </w:rPr>
-        <w:t>Z-score</w:t>
-      </w:r>
-      <w:r>
-        <w:rPr>
-          <w:rFonts w:ascii="Yu Gothic" w:hAnsi="Yu Gothic" w:eastAsia="Yu Gothic"/>
-          <w:b w:val="false"/>
-          <w:i w:val="false"/>
-          <w:color w:val="334155"/>
-          <w:sz w:val="20"/>
-        </w:rPr>
-        <w:t>正規化を適用。外れ値（</w:t>
-      </w:r>
-      <w:r>
-        <w:rPr>
-          <w:rFonts w:eastAsia="Yu Gothic" w:ascii="Yu Gothic" w:hAnsi="Yu Gothic"/>
-          <w:b w:val="false"/>
-          <w:i w:val="false"/>
-          <w:color w:val="334155"/>
-          <w:sz w:val="20"/>
-        </w:rPr>
-        <w:t>3σ</w:t>
-      </w:r>
-      <w:r>
-        <w:rPr>
-          <w:rFonts w:ascii="Yu Gothic" w:hAnsi="Yu Gothic" w:eastAsia="Yu Gothic"/>
-          <w:b w:val="false"/>
-          <w:i w:val="false"/>
-          <w:color w:val="334155"/>
-          <w:sz w:val="20"/>
-        </w:rPr>
-        <w:t>超過）および欠損フレームの自動補間処理を実装。</w:t>
-      </w:r>
-    </w:p>
-    <w:p>
-      <w:pPr>
-        <w:pStyle w:val="Heading1"/>
-        <w:spacing w:before="280" w:after="120"/>
-        <w:rPr/>
-      </w:pPr>
-      <w:r>
-        <w:rPr>
-          <w:rFonts w:eastAsia="Yu Gothic" w:ascii="Yu Gothic" w:hAnsi="Yu Gothic"/>
-          <w:b/>
-          <w:i w:val="false"/>
-          <w:color w:val="1E3A8A"/>
-          <w:sz w:val="28"/>
-        </w:rPr>
-        <w:t xml:space="preserve">5. Step 4: </w:t>
-      </w:r>
-      <w:r>
-        <w:rPr>
-          <w:rFonts w:ascii="Yu Gothic" w:hAnsi="Yu Gothic" w:eastAsia="Yu Gothic"/>
-          <w:b/>
-          <w:i w:val="false"/>
-          <w:color w:val="1E3A8A"/>
-          <w:sz w:val="28"/>
-        </w:rPr>
-        <w:t xml:space="preserve">初期模倣学習 </w:t>
-      </w:r>
-      <w:r>
-        <w:rPr>
-          <w:rFonts w:eastAsia="Yu Gothic" w:ascii="Yu Gothic" w:hAnsi="Yu Gothic"/>
-          <w:b/>
-          <w:i w:val="false"/>
-          <w:color w:val="1E3A8A"/>
-          <w:sz w:val="28"/>
-        </w:rPr>
-        <w:t xml:space="preserve">(ACT) </w:t>
-      </w:r>
-      <w:r>
-        <w:rPr>
-          <w:rFonts w:ascii="Yu Gothic" w:hAnsi="Yu Gothic" w:eastAsia="Yu Gothic"/>
-          <w:b/>
-          <w:i w:val="false"/>
-          <w:color w:val="1E3A8A"/>
-          <w:sz w:val="28"/>
-        </w:rPr>
-        <w:t>＆ 人手データの限界</w:t>
-      </w:r>
-    </w:p>
-    <w:p>
-      <w:pPr>
-        <w:pStyle w:val="ListBullet"/>
-        <w:numPr>
-          <w:ilvl w:val="0"/>
-          <w:numId w:val="1"/>
-        </w:numPr>
-        <w:spacing w:lineRule="auto" w:line="300" w:before="20" w:after="60"/>
-        <w:ind w:left="360" w:hanging="360"/>
-        <w:contextualSpacing/>
-        <w:rPr/>
-      </w:pPr>
-      <w:r>
-        <w:rPr>
-          <w:rFonts w:ascii="Yu Gothic" w:hAnsi="Yu Gothic" w:eastAsia="Yu Gothic"/>
-          <w:b/>
-          <w:i w:val="false"/>
-          <w:color w:val="0F172A"/>
-          <w:sz w:val="20"/>
-        </w:rPr>
-        <w:t>目的</w:t>
-      </w:r>
-      <w:r>
-        <w:rPr>
-          <w:rFonts w:eastAsia="Yu Gothic" w:ascii="Yu Gothic" w:hAnsi="Yu Gothic"/>
-          <w:b/>
-          <w:i w:val="false"/>
-          <w:color w:val="0F172A"/>
-          <w:sz w:val="20"/>
-        </w:rPr>
-        <w:t xml:space="preserve">: </w:t>
-      </w:r>
-      <w:r>
-        <w:rPr>
-          <w:rFonts w:ascii="Yu Gothic" w:hAnsi="Yu Gothic" w:eastAsia="Yu Gothic"/>
-          <w:b w:val="false"/>
-          <w:i w:val="false"/>
-          <w:color w:val="334155"/>
-          <w:sz w:val="20"/>
-        </w:rPr>
-        <w:t>人手収集データに基づく初期模倣学習モデル（</w:t>
-      </w:r>
-      <w:r>
-        <w:rPr>
-          <w:rFonts w:eastAsia="Yu Gothic" w:ascii="Yu Gothic" w:hAnsi="Yu Gothic"/>
-          <w:b w:val="false"/>
-          <w:i w:val="false"/>
-          <w:color w:val="334155"/>
-          <w:sz w:val="20"/>
-        </w:rPr>
-        <w:t>Action Chunking with Transformers: ACT</w:t>
-      </w:r>
-      <w:r>
-        <w:rPr>
-          <w:rFonts w:ascii="Yu Gothic" w:hAnsi="Yu Gothic" w:eastAsia="Yu Gothic"/>
-          <w:b w:val="false"/>
-          <w:i w:val="false"/>
-          <w:color w:val="334155"/>
-          <w:sz w:val="20"/>
-        </w:rPr>
-        <w:t>）を構築し、自律実行性能および限界要因を特定。</w:t>
-      </w:r>
-    </w:p>
-    <w:p>
-      <w:pPr>
-        <w:pStyle w:val="ListBullet"/>
-        <w:numPr>
-          <w:ilvl w:val="0"/>
-          <w:numId w:val="1"/>
-        </w:numPr>
-        <w:spacing w:lineRule="auto" w:line="300" w:before="20" w:after="60"/>
-        <w:ind w:left="360" w:hanging="360"/>
-        <w:contextualSpacing/>
-        <w:rPr/>
-      </w:pPr>
-      <w:r>
-        <w:rPr>
-          <w:rFonts w:ascii="Yu Gothic" w:hAnsi="Yu Gothic" w:eastAsia="Yu Gothic"/>
-          <w:b/>
-          <w:i w:val="false"/>
-          <w:color w:val="0F172A"/>
-          <w:sz w:val="20"/>
-        </w:rPr>
-        <w:t>モデル構造</w:t>
-      </w:r>
-      <w:r>
-        <w:rPr>
-          <w:rFonts w:eastAsia="Yu Gothic" w:ascii="Yu Gothic" w:hAnsi="Yu Gothic"/>
-          <w:b/>
-          <w:i w:val="false"/>
-          <w:color w:val="0F172A"/>
-          <w:sz w:val="20"/>
-        </w:rPr>
-        <w:t xml:space="preserve">: </w:t>
-      </w:r>
-      <w:r>
-        <w:rPr>
-          <w:rFonts w:eastAsia="Yu Gothic" w:ascii="Yu Gothic" w:hAnsi="Yu Gothic"/>
-          <w:b w:val="false"/>
-          <w:i w:val="false"/>
-          <w:color w:val="334155"/>
-          <w:sz w:val="20"/>
-        </w:rPr>
-        <w:t xml:space="preserve">ResNet-18 </w:t>
-      </w:r>
-      <w:r>
-        <w:rPr>
-          <w:rFonts w:ascii="Yu Gothic" w:hAnsi="Yu Gothic" w:eastAsia="Yu Gothic"/>
-          <w:b w:val="false"/>
-          <w:i w:val="false"/>
-          <w:color w:val="334155"/>
-          <w:sz w:val="20"/>
-        </w:rPr>
-        <w:t xml:space="preserve">バックボーンによる双眼画像特徴抽出器 ＋ </w:t>
-      </w:r>
-      <w:r>
-        <w:rPr>
-          <w:rFonts w:eastAsia="Yu Gothic" w:ascii="Yu Gothic" w:hAnsi="Yu Gothic"/>
-          <w:b w:val="false"/>
-          <w:i w:val="false"/>
-          <w:color w:val="334155"/>
-          <w:sz w:val="20"/>
-        </w:rPr>
-        <w:t>CVAE</w:t>
-      </w:r>
-      <w:r>
-        <w:rPr>
-          <w:rFonts w:ascii="Yu Gothic" w:hAnsi="Yu Gothic" w:eastAsia="Yu Gothic"/>
-          <w:b w:val="false"/>
-          <w:i w:val="false"/>
-          <w:color w:val="334155"/>
-          <w:sz w:val="20"/>
-        </w:rPr>
-        <w:t>（</w:t>
-      </w:r>
-      <w:r>
-        <w:rPr>
-          <w:rFonts w:eastAsia="Yu Gothic" w:ascii="Yu Gothic" w:hAnsi="Yu Gothic"/>
-          <w:b w:val="false"/>
-          <w:i w:val="false"/>
-          <w:color w:val="334155"/>
-          <w:sz w:val="20"/>
-        </w:rPr>
-        <w:t>Conditional Variational Autoencoder</w:t>
-      </w:r>
-      <w:r>
-        <w:rPr>
-          <w:rFonts w:ascii="Yu Gothic" w:hAnsi="Yu Gothic" w:eastAsia="Yu Gothic"/>
-          <w:b w:val="false"/>
-          <w:i w:val="false"/>
-          <w:color w:val="334155"/>
-          <w:sz w:val="20"/>
-        </w:rPr>
-        <w:t>）によるマルチモーダル軌道生成器。</w:t>
-      </w:r>
-    </w:p>
-    <w:p>
-      <w:pPr>
-        <w:pStyle w:val="ListBullet"/>
-        <w:numPr>
-          <w:ilvl w:val="0"/>
-          <w:numId w:val="1"/>
-        </w:numPr>
-        <w:spacing w:lineRule="auto" w:line="300" w:before="20" w:after="60"/>
-        <w:ind w:left="360" w:hanging="360"/>
-        <w:contextualSpacing/>
-        <w:rPr/>
-      </w:pPr>
-      <w:r>
-        <w:rPr>
-          <w:rFonts w:ascii="Yu Gothic" w:hAnsi="Yu Gothic" w:eastAsia="Yu Gothic"/>
-          <w:b/>
-          <w:i w:val="false"/>
-          <w:color w:val="0F172A"/>
-          <w:sz w:val="20"/>
-        </w:rPr>
-        <w:t>露呈した課題と技術的ボトルネック</w:t>
-      </w:r>
-      <w:r>
-        <w:rPr>
-          <w:rFonts w:eastAsia="Yu Gothic" w:ascii="Yu Gothic" w:hAnsi="Yu Gothic"/>
-          <w:b/>
-          <w:i w:val="false"/>
-          <w:color w:val="0F172A"/>
-          <w:sz w:val="20"/>
-        </w:rPr>
-        <w:t xml:space="preserve">: </w:t>
-      </w:r>
-    </w:p>
-    <w:p>
-      <w:pPr>
-        <w:pStyle w:val="ListBullet"/>
-        <w:numPr>
-          <w:ilvl w:val="0"/>
-          <w:numId w:val="1"/>
-        </w:numPr>
-        <w:spacing w:lineRule="auto" w:line="300" w:before="20" w:after="60"/>
-        <w:ind w:left="720" w:hanging="360"/>
-        <w:contextualSpacing/>
-        <w:rPr/>
-      </w:pPr>
-      <w:r>
-        <w:rPr>
-          <w:rFonts w:ascii="Yu Gothic" w:hAnsi="Yu Gothic" w:eastAsia="Yu Gothic"/>
-          <w:b/>
-          <w:i w:val="false"/>
-          <w:color w:val="0F172A"/>
-          <w:sz w:val="20"/>
-        </w:rPr>
-        <w:t>・複合誤差（</w:t>
-      </w:r>
-      <w:r>
-        <w:rPr>
-          <w:rFonts w:eastAsia="Yu Gothic" w:ascii="Yu Gothic" w:hAnsi="Yu Gothic"/>
-          <w:b/>
-          <w:i w:val="false"/>
-          <w:color w:val="0F172A"/>
-          <w:sz w:val="20"/>
-        </w:rPr>
-        <w:t>Covariate Shift</w:t>
-      </w:r>
-      <w:r>
-        <w:rPr>
-          <w:rFonts w:ascii="Yu Gothic" w:hAnsi="Yu Gothic" w:eastAsia="Yu Gothic"/>
-          <w:b/>
-          <w:i w:val="false"/>
-          <w:color w:val="0F172A"/>
-          <w:sz w:val="20"/>
-        </w:rPr>
-        <w:t>）の蓄積</w:t>
-      </w:r>
-      <w:r>
-        <w:rPr>
-          <w:rFonts w:eastAsia="Yu Gothic" w:ascii="Yu Gothic" w:hAnsi="Yu Gothic"/>
-          <w:b/>
-          <w:i w:val="false"/>
-          <w:color w:val="0F172A"/>
-          <w:sz w:val="20"/>
-        </w:rPr>
-        <w:t xml:space="preserve">: </w:t>
-      </w:r>
-      <w:r>
-        <w:rPr>
-          <w:rFonts w:ascii="Yu Gothic" w:hAnsi="Yu Gothic" w:eastAsia="Yu Gothic"/>
-          <w:b w:val="false"/>
-          <w:i w:val="false"/>
-          <w:color w:val="334155"/>
-          <w:sz w:val="20"/>
-        </w:rPr>
-        <w:t>自己回帰的な推論実行時、微小な予測誤差がステップごとに累積。一度ペグ把持位置が中心からずれると復元できず、軌道が発散。</w:t>
-      </w:r>
-    </w:p>
-    <w:p>
-      <w:pPr>
-        <w:pStyle w:val="ListBullet"/>
-        <w:numPr>
-          <w:ilvl w:val="0"/>
-          <w:numId w:val="1"/>
-        </w:numPr>
-        <w:spacing w:lineRule="auto" w:line="300" w:before="20" w:after="60"/>
-        <w:ind w:left="720" w:hanging="360"/>
-        <w:contextualSpacing/>
-        <w:rPr/>
-      </w:pPr>
-      <w:r>
-        <w:rPr>
-          <w:rFonts w:ascii="Yu Gothic" w:hAnsi="Yu Gothic" w:eastAsia="Yu Gothic"/>
-          <w:b/>
-          <w:i w:val="false"/>
-          <w:color w:val="0F172A"/>
-          <w:sz w:val="20"/>
-        </w:rPr>
-        <w:t>・接触幾何（クリアランス</w:t>
-      </w:r>
-      <w:r>
-        <w:rPr>
-          <w:rFonts w:eastAsia="Yu Gothic" w:ascii="Yu Gothic" w:hAnsi="Yu Gothic"/>
-          <w:b/>
-          <w:i w:val="false"/>
-          <w:color w:val="0F172A"/>
-          <w:sz w:val="20"/>
-        </w:rPr>
-        <w:t>2mm</w:t>
-      </w:r>
-      <w:r>
-        <w:rPr>
-          <w:rFonts w:ascii="Yu Gothic" w:hAnsi="Yu Gothic" w:eastAsia="Yu Gothic"/>
-          <w:b/>
-          <w:i w:val="false"/>
-          <w:color w:val="0F172A"/>
-          <w:sz w:val="20"/>
-        </w:rPr>
-        <w:t>）の壁</w:t>
-      </w:r>
-      <w:r>
-        <w:rPr>
-          <w:rFonts w:eastAsia="Yu Gothic" w:ascii="Yu Gothic" w:hAnsi="Yu Gothic"/>
-          <w:b/>
-          <w:i w:val="false"/>
-          <w:color w:val="0F172A"/>
-          <w:sz w:val="20"/>
-        </w:rPr>
-        <w:t xml:space="preserve">: </w:t>
-      </w:r>
-      <w:r>
-        <w:rPr>
-          <w:rFonts w:ascii="Yu Gothic" w:hAnsi="Yu Gothic" w:eastAsia="Yu Gothic"/>
-          <w:b w:val="false"/>
-          <w:i w:val="false"/>
-          <w:color w:val="334155"/>
-          <w:sz w:val="20"/>
-        </w:rPr>
-        <w:t>クリアランス</w:t>
-      </w:r>
-      <w:r>
-        <w:rPr>
-          <w:rFonts w:eastAsia="Yu Gothic" w:ascii="Yu Gothic" w:hAnsi="Yu Gothic"/>
-          <w:b w:val="false"/>
-          <w:i w:val="false"/>
-          <w:color w:val="334155"/>
-          <w:sz w:val="20"/>
-        </w:rPr>
-        <w:t>2mm</w:t>
-      </w:r>
-      <w:r>
-        <w:rPr>
-          <w:rFonts w:ascii="Yu Gothic" w:hAnsi="Yu Gothic" w:eastAsia="Yu Gothic"/>
-          <w:b w:val="false"/>
-          <w:i w:val="false"/>
-          <w:color w:val="334155"/>
-          <w:sz w:val="20"/>
-        </w:rPr>
-        <w:t>の円柱挿入では、傾斜角がわずか</w:t>
-      </w:r>
-      <w:r>
-        <w:rPr>
-          <w:rFonts w:eastAsia="Yu Gothic" w:ascii="Yu Gothic" w:hAnsi="Yu Gothic"/>
-          <w:b w:val="false"/>
-          <w:i w:val="false"/>
-          <w:color w:val="334155"/>
-          <w:sz w:val="20"/>
-        </w:rPr>
-        <w:t>2</w:t>
+        <w:t>人間が手動で集められるのは十数回が限界であり、ペグの置き場所が変わると対応できず、実効成功率は</w:t>
+      </w:r>
+      <w:r>
+        <w:rPr>
+          <w:rFonts w:eastAsia="Yu Gothic" w:ascii="Yu Gothic" w:hAnsi="Yu Gothic"/>
+          <w:b w:val="false"/>
+          <w:i w:val="false"/>
+          <w:color w:val="334155"/>
+          <w:sz w:val="20"/>
+        </w:rPr>
+        <w:t>15</w:t>
       </w:r>
       <w:r>
         <w:rPr>
@@ -4129,100 +4142,17 @@
           <w:color w:val="334155"/>
           <w:sz w:val="20"/>
         </w:rPr>
-        <w:t>3</w:t>
-      </w:r>
-      <w:r>
-        <w:rPr>
-          <w:rFonts w:ascii="Yu Gothic" w:hAnsi="Yu Gothic" w:eastAsia="Yu Gothic"/>
-          <w:b w:val="false"/>
-          <w:i w:val="false"/>
-          <w:color w:val="334155"/>
-          <w:sz w:val="20"/>
-        </w:rPr>
-        <w:t>度生じるだけで摩擦ロック（カジリ）が発生。純粋な人手行動模倣では物理接触の反力適応が困難。</w:t>
-      </w:r>
-    </w:p>
-    <w:p>
-      <w:pPr>
-        <w:pStyle w:val="ListBullet"/>
-        <w:numPr>
-          <w:ilvl w:val="0"/>
-          <w:numId w:val="1"/>
-        </w:numPr>
-        <w:spacing w:lineRule="auto" w:line="300" w:before="20" w:after="60"/>
-        <w:ind w:left="720" w:hanging="360"/>
-        <w:contextualSpacing/>
-        <w:rPr/>
-      </w:pPr>
-      <w:r>
-        <w:rPr>
-          <w:rFonts w:ascii="Yu Gothic" w:hAnsi="Yu Gothic" w:eastAsia="Yu Gothic"/>
-          <w:b/>
-          <w:i w:val="false"/>
-          <w:color w:val="0F172A"/>
-          <w:sz w:val="20"/>
-        </w:rPr>
-        <w:t>・データ効率の限界</w:t>
-      </w:r>
-      <w:r>
-        <w:rPr>
-          <w:rFonts w:eastAsia="Yu Gothic" w:ascii="Yu Gothic" w:hAnsi="Yu Gothic"/>
-          <w:b/>
-          <w:i w:val="false"/>
-          <w:color w:val="0F172A"/>
-          <w:sz w:val="20"/>
-        </w:rPr>
-        <w:t xml:space="preserve">: </w:t>
-      </w:r>
-      <w:r>
-        <w:rPr>
-          <w:rFonts w:ascii="Yu Gothic" w:hAnsi="Yu Gothic" w:eastAsia="Yu Gothic"/>
-          <w:b w:val="false"/>
-          <w:i w:val="false"/>
-          <w:color w:val="334155"/>
-          <w:sz w:val="20"/>
-        </w:rPr>
-        <w:t xml:space="preserve">人手による十数エピソードの教示データでは、作業空間全域（任意座標）を網羅できず、未学習領域でのタスク成功率が極めて低迷（実効成功率 </w:t>
-      </w:r>
-      <w:r>
-        <w:rPr>
-          <w:rFonts w:eastAsia="Yu Gothic" w:ascii="Yu Gothic" w:hAnsi="Yu Gothic"/>
-          <w:b w:val="false"/>
-          <w:i w:val="false"/>
-          <w:color w:val="334155"/>
-          <w:sz w:val="20"/>
-        </w:rPr>
-        <w:t>15</w:t>
-      </w:r>
-      <w:r>
-        <w:rPr>
-          <w:rFonts w:ascii="Yu Gothic" w:hAnsi="Yu Gothic" w:eastAsia="Yu Gothic"/>
-          <w:b w:val="false"/>
-          <w:i w:val="false"/>
-          <w:color w:val="334155"/>
-          <w:sz w:val="20"/>
-        </w:rPr>
-        <w:t>〜</w:t>
-      </w:r>
-      <w:r>
-        <w:rPr>
-          <w:rFonts w:eastAsia="Yu Gothic" w:ascii="Yu Gothic" w:hAnsi="Yu Gothic"/>
-          <w:b w:val="false"/>
-          <w:i w:val="false"/>
-          <w:color w:val="334155"/>
-          <w:sz w:val="20"/>
-        </w:rPr>
-        <w:t xml:space="preserve">20% </w:t>
-      </w:r>
-      <w:r>
-        <w:rPr>
-          <w:rFonts w:ascii="Yu Gothic" w:hAnsi="Yu Gothic" w:eastAsia="Yu Gothic"/>
-          <w:b w:val="false"/>
-          <w:i w:val="false"/>
-          <w:color w:val="334155"/>
-          <w:sz w:val="20"/>
-        </w:rPr>
-        <w:t>程度にとどまる）。</w:t>
+        <w:t>20%</w:t>
+      </w:r>
+      <w:r>
+        <w:rPr>
+          <w:rFonts w:ascii="Yu Gothic" w:hAnsi="Yu Gothic" w:eastAsia="Yu Gothic"/>
+          <w:b w:val="false"/>
+          <w:i w:val="false"/>
+          <w:color w:val="334155"/>
+          <w:sz w:val="20"/>
+        </w:rPr>
+        <w:t>程度にとどまりました。</w:t>
       </w:r>
     </w:p>
     <w:tbl>
@@ -4277,7 +4207,7 @@
                 <w:color w:val="334155"/>
                 <w:sz w:val="19"/>
               </w:rPr>
-              <w:t>人手テレオペの収集数増加による力まかせなアプローチは、コスト対効果および物理精度面で破綻する。本課題を突破するためには、『ロボット工学的補正制御を備えた高精度物理モデル』を確立し、その自律的ロールアウトから自己学習（自己改善ループ）を回すことが不可欠である。</w:t>
+              <w:t>人間が手作業で教示データを増やし続けるアプローチは、コスト的にも精度面でも限界があります。この課題を根本から突破するため、ロボット工学の補正技術を取り入れた高精度な物理モデルを作り、そこからロボット自身が自律的にデータを生み出して学ぶ自己改善の仕組みが不可欠と判断しました。</w:t>
             </w:r>
           </w:p>
         </w:tc>
@@ -4360,27 +4290,27 @@
           <w:color w:val="334155"/>
           <w:sz w:val="20"/>
         </w:rPr>
-        <w:t>人手データへの依存を脱却し、ロボット工学（逆運動学・機構幾何学）とコンピュータビジョン（</w:t>
-      </w:r>
-      <w:r>
-        <w:rPr>
-          <w:rFonts w:eastAsia="Yu Gothic" w:ascii="Yu Gothic" w:hAnsi="Yu Gothic"/>
-          <w:b w:val="false"/>
-          <w:i w:val="false"/>
-          <w:color w:val="334155"/>
-          <w:sz w:val="20"/>
-        </w:rPr>
-        <w:t>HSV</w:t>
-      </w:r>
-      <w:r>
-        <w:rPr>
-          <w:rFonts w:ascii="Yu Gothic" w:hAnsi="Yu Gothic" w:eastAsia="Yu Gothic"/>
-          <w:b w:val="false"/>
-          <w:i w:val="false"/>
-          <w:color w:val="334155"/>
-          <w:sz w:val="20"/>
-        </w:rPr>
-        <w:t>色空間モーメント解析・閉ループ視覚サーボ）を統合した「</w:t>
+        <w:t>人手データへの依存を脱却し、逆運動学（</w:t>
+      </w:r>
+      <w:r>
+        <w:rPr>
+          <w:rFonts w:eastAsia="Yu Gothic" w:ascii="Yu Gothic" w:hAnsi="Yu Gothic"/>
+          <w:b w:val="false"/>
+          <w:i w:val="false"/>
+          <w:color w:val="334155"/>
+          <w:sz w:val="20"/>
+        </w:rPr>
+        <w:t>IK</w:t>
+      </w:r>
+      <w:r>
+        <w:rPr>
+          <w:rFonts w:ascii="Yu Gothic" w:hAnsi="Yu Gothic" w:eastAsia="Yu Gothic"/>
+          <w:b w:val="false"/>
+          <w:i w:val="false"/>
+          <w:color w:val="334155"/>
+          <w:sz w:val="20"/>
+        </w:rPr>
+        <w:t>）とカメラ画像によるフィードバック（視覚サーボ）を組み合わせ、どんな位置のペグでも</w:t>
       </w:r>
       <w:r>
         <w:rPr>
@@ -4400,7 +4330,7 @@
           <w:color w:val="334155"/>
           <w:sz w:val="20"/>
         </w:rPr>
-        <w:t>成功する高精度物理エキスパート（</w:t>
+        <w:t>確実に挿入できる『物理エキスパート（</w:t>
       </w:r>
       <w:r>
         <w:rPr>
@@ -4420,7 +4350,7 @@
           <w:color w:val="334155"/>
           <w:sz w:val="20"/>
         </w:rPr>
-        <w:t>）」を確立。</w:t>
+        <w:t>）』を構築。</w:t>
       </w:r>
     </w:p>
     <w:p>
@@ -4453,7 +4383,7 @@
           <w:color w:val="0F172A"/>
           <w:sz w:val="20"/>
         </w:rPr>
-        <w:t>直動アプローチ</w:t>
+        <w:t>直線移動</w:t>
       </w:r>
       <w:r>
         <w:rPr>
@@ -4546,7 +4476,7 @@
           <w:color w:val="334155"/>
           <w:sz w:val="20"/>
         </w:rPr>
-        <w:t>推定位置に基づき、直動補間によるアプローチおよび挿入を実施。</w:t>
+        <w:t>推定位置に基づき、直線補間によるアプローチおよび挿入を実施。</w:t>
       </w:r>
     </w:p>
     <w:p>
@@ -4589,7 +4519,7 @@
           <w:color w:val="334155"/>
           <w:sz w:val="20"/>
         </w:rPr>
-        <w:t>斜め方向からの直動進入では、挿入初期にペグ外周が穴の縁（土手）に干渉し、反力によってペグが斜めに傾倒する事象が発生（図</w:t>
+        <w:t>斜め方向からの直線移動では、挿入初期にペグ外周が穴の縁（土手）にぶつかり、反力で斜めに傾倒する事象が発生（図</w:t>
       </w:r>
       <w:r>
         <w:rPr>
@@ -4695,7 +4625,7 @@
           <w:color w:val="64748B"/>
           <w:sz w:val="18"/>
         </w:rPr>
-        <w:t>直動アプローチ時の関節角度・角速度テレメトリ</w:t>
+        <w:t>直線アプローチ時の関節角度・角速度テレメトリ</w:t>
       </w:r>
     </w:p>
     <w:p>
@@ -4728,7 +4658,7 @@
           <w:color w:val="0F172A"/>
           <w:sz w:val="20"/>
         </w:rPr>
-        <w:t>ヘリコプター型高空アプローチ ＆ ペグ底部中心視覚サーボ</w:t>
+        <w:t>ヘリコプター型進入 ＆ ペグ底部直接視覚サーボ</w:t>
       </w:r>
       <w:r>
         <w:rPr>
@@ -4801,7 +4731,7 @@
           <w:color w:val="334155"/>
           <w:sz w:val="20"/>
         </w:rPr>
-        <w:t>）まで垂直上昇し、受台穴の鉛直直上へ水平移動後、真上から垂直降下する多段階軌道シーケンスを採用。</w:t>
+        <w:t>）まで真上に持ち上げ、穴の真上へ水平移動してから垂直に下降する手順をとることで、周囲への衝突を完全に回避。</w:t>
       </w:r>
     </w:p>
     <w:p>
@@ -4824,7 +4754,7 @@
           <w:color w:val="0F172A"/>
           <w:sz w:val="20"/>
         </w:rPr>
-        <w:t>・ペグ底部直接視覚サーボ</w:t>
+        <w:t>・ペグ底部の直接視覚サーボ</w:t>
       </w:r>
       <w:r>
         <w:rPr>
@@ -4844,7 +4774,7 @@
           <w:color w:val="334155"/>
           <w:sz w:val="20"/>
         </w:rPr>
-        <w:t>ペグ上面ではなく、穴と接触する『ペグ底部』の接地中心をサブカメラ・メインカメラで直接トラッキングし、穴中心との水平偏差をゼロに収束。</w:t>
+        <w:t>ペグ上面ではなく、実際に穴と接触する『ペグ底部』の接地中心をカメラで直接捉えて位置合わせを実施。</w:t>
       </w:r>
     </w:p>
     <w:p>
@@ -4897,7 +4827,27 @@
           <w:color w:val="334155"/>
           <w:sz w:val="20"/>
         </w:rPr>
-        <w:t>グリッパー特有のリンク開閉幾何学に伴うオフセットを逆運動学段階で先回り補正。</w:t>
+        <w:t>グリッパー特有の左右爪長差（</w:t>
+      </w:r>
+      <w:r>
+        <w:rPr>
+          <w:rFonts w:eastAsia="Yu Gothic" w:ascii="Yu Gothic" w:hAnsi="Yu Gothic"/>
+          <w:b w:val="false"/>
+          <w:i w:val="false"/>
+          <w:color w:val="334155"/>
+          <w:sz w:val="20"/>
+        </w:rPr>
+        <w:t>13mm</w:t>
+      </w:r>
+      <w:r>
+        <w:rPr>
+          <w:rFonts w:ascii="Yu Gothic" w:hAnsi="Yu Gothic" w:eastAsia="Yu Gothic"/>
+          <w:b w:val="false"/>
+          <w:i w:val="false"/>
+          <w:color w:val="334155"/>
+          <w:sz w:val="20"/>
+        </w:rPr>
+        <w:t>）や開閉リンク幾何学に伴う偏角を逆運動学段階で先回り補正。</w:t>
       </w:r>
     </w:p>
     <w:p>
@@ -4920,7 +4870,7 @@
           <w:color w:val="0F172A"/>
           <w:sz w:val="20"/>
         </w:rPr>
-        <w:t>・土手ダンピング ＆ 自立化リリース</w:t>
+        <w:t>・土手への突き当て整列 ＆ 自立化リリース</w:t>
       </w:r>
       <w:r>
         <w:rPr>
@@ -4940,27 +4890,7 @@
           <w:color w:val="334155"/>
           <w:sz w:val="20"/>
         </w:rPr>
-        <w:t>穴進入時にグリッパーを微小解放（</w:t>
-      </w:r>
-      <w:r>
-        <w:rPr>
-          <w:rFonts w:eastAsia="Yu Gothic" w:ascii="Yu Gothic" w:hAnsi="Yu Gothic"/>
-          <w:b w:val="false"/>
-          <w:i w:val="false"/>
-          <w:color w:val="334155"/>
-          <w:sz w:val="20"/>
-        </w:rPr>
-        <w:t>Compliance Release</w:t>
-      </w:r>
-      <w:r>
-        <w:rPr>
-          <w:rFonts w:ascii="Yu Gothic" w:hAnsi="Yu Gothic" w:eastAsia="Yu Gothic"/>
-          <w:b w:val="false"/>
-          <w:i w:val="false"/>
-          <w:color w:val="334155"/>
-          <w:sz w:val="20"/>
-        </w:rPr>
-        <w:t>）し、接触反力を逃がしながら自重で直立挿入を完了させる自立化制御を導入。</w:t>
+        <w:t>台座の壁に軽く突き当ててペグの姿勢をまっすぐに整え、穴に入った瞬間にグリッパーの力を抜いて自重でストンと着底させる機械的制御を導入。</w:t>
       </w:r>
     </w:p>
     <w:p>
@@ -5329,7 +5259,7 @@
           <w:color w:val="334155"/>
           <w:sz w:val="20"/>
         </w:rPr>
-        <w:t>モデルを育成・実証した。</w:t>
+        <w:t>モデルを育成・実証しました。</w:t>
       </w:r>
     </w:p>
     <w:p>
@@ -5399,7 +5329,7 @@
           <w:color w:val="0F172A"/>
           <w:sz w:val="20"/>
         </w:rPr>
-        <w:t>自動実演エンジン稼働</w:t>
+        <w:t>自動実演エンジンによる自律収集</w:t>
       </w:r>
       <w:r>
         <w:rPr>
@@ -5439,7 +5369,7 @@
           <w:color w:val="334155"/>
           <w:sz w:val="20"/>
         </w:rPr>
-        <w:t>シミュレータ内でペグ初期位置を任意に摂動させながら、</w:t>
+        <w:t>シミュレータ内でペグの位置をランダムにずらしながら、</w:t>
       </w:r>
       <w:r>
         <w:rPr>
@@ -5459,7 +5389,7 @@
           <w:color w:val="334155"/>
           <w:sz w:val="20"/>
         </w:rPr>
-        <w:t>物理エキスパートによる高精度挿入を連続自律実行。</w:t>
+        <w:t>の物理エキスパートが連続して自律挿入を実行。</w:t>
       </w:r>
     </w:p>
     <w:p>
@@ -5482,7 +5412,7 @@
           <w:color w:val="0F172A"/>
           <w:sz w:val="20"/>
         </w:rPr>
-        <w:t>データ記録仕様</w:t>
+        <w:t>収集エピソード数と実ステップ数（具体値）</w:t>
       </w:r>
       <w:r>
         <w:rPr>
@@ -5502,7 +5432,410 @@
           <w:color w:val="334155"/>
           <w:sz w:val="20"/>
         </w:rPr>
-        <w:t>実物理環境における接触反力、スリップ、カメラオプティカルフローを内包した数千ステップに及ぶ実画像・実関節テレメトリを完全記録。</w:t>
+        <w:t>通常サイド（</w:t>
+      </w:r>
+      <w:r>
+        <w:rPr>
+          <w:rFonts w:eastAsia="Yu Gothic" w:ascii="Yu Gothic" w:hAnsi="Yu Gothic"/>
+          <w:b w:val="false"/>
+          <w:i w:val="false"/>
+          <w:color w:val="334155"/>
+          <w:sz w:val="20"/>
+        </w:rPr>
+        <w:t>Y &gt; 0</w:t>
+      </w:r>
+      <w:r>
+        <w:rPr>
+          <w:rFonts w:ascii="Yu Gothic" w:hAnsi="Yu Gothic" w:eastAsia="Yu Gothic"/>
+          <w:b w:val="false"/>
+          <w:i w:val="false"/>
+          <w:color w:val="334155"/>
+          <w:sz w:val="20"/>
+        </w:rPr>
+        <w:t>）</w:t>
+      </w:r>
+      <w:r>
+        <w:rPr>
+          <w:rFonts w:eastAsia="Yu Gothic" w:ascii="Yu Gothic" w:hAnsi="Yu Gothic"/>
+          <w:b w:val="false"/>
+          <w:i w:val="false"/>
+          <w:color w:val="334155"/>
+          <w:sz w:val="20"/>
+        </w:rPr>
+        <w:t>5</w:t>
+      </w:r>
+      <w:r>
+        <w:rPr>
+          <w:rFonts w:ascii="Yu Gothic" w:hAnsi="Yu Gothic" w:eastAsia="Yu Gothic"/>
+          <w:b w:val="false"/>
+          <w:i w:val="false"/>
+          <w:color w:val="334155"/>
+          <w:sz w:val="20"/>
+        </w:rPr>
+        <w:t>配置、逆サイド（</w:t>
+      </w:r>
+      <w:r>
+        <w:rPr>
+          <w:rFonts w:eastAsia="Yu Gothic" w:ascii="Yu Gothic" w:hAnsi="Yu Gothic"/>
+          <w:b w:val="false"/>
+          <w:i w:val="false"/>
+          <w:color w:val="334155"/>
+          <w:sz w:val="20"/>
+        </w:rPr>
+        <w:t>Y &lt; 0</w:t>
+      </w:r>
+      <w:r>
+        <w:rPr>
+          <w:rFonts w:ascii="Yu Gothic" w:hAnsi="Yu Gothic" w:eastAsia="Yu Gothic"/>
+          <w:b w:val="false"/>
+          <w:i w:val="false"/>
+          <w:color w:val="334155"/>
+          <w:sz w:val="20"/>
+        </w:rPr>
+        <w:t>）</w:t>
+      </w:r>
+      <w:r>
+        <w:rPr>
+          <w:rFonts w:eastAsia="Yu Gothic" w:ascii="Yu Gothic" w:hAnsi="Yu Gothic"/>
+          <w:b w:val="false"/>
+          <w:i w:val="false"/>
+          <w:color w:val="334155"/>
+          <w:sz w:val="20"/>
+        </w:rPr>
+        <w:t>5</w:t>
+      </w:r>
+      <w:r>
+        <w:rPr>
+          <w:rFonts w:ascii="Yu Gothic" w:hAnsi="Yu Gothic" w:eastAsia="Yu Gothic"/>
+          <w:b w:val="false"/>
+          <w:i w:val="false"/>
+          <w:color w:val="334155"/>
+          <w:sz w:val="20"/>
+        </w:rPr>
+        <w:t>配置の計</w:t>
+      </w:r>
+      <w:r>
+        <w:rPr>
+          <w:rFonts w:eastAsia="Yu Gothic" w:ascii="Yu Gothic" w:hAnsi="Yu Gothic"/>
+          <w:b w:val="false"/>
+          <w:i w:val="false"/>
+          <w:color w:val="334155"/>
+          <w:sz w:val="20"/>
+        </w:rPr>
+        <w:t>10</w:t>
+      </w:r>
+      <w:r>
+        <w:rPr>
+          <w:rFonts w:ascii="Yu Gothic" w:hAnsi="Yu Gothic" w:eastAsia="Yu Gothic"/>
+          <w:b w:val="false"/>
+          <w:i w:val="false"/>
+          <w:color w:val="334155"/>
+          <w:sz w:val="20"/>
+        </w:rPr>
+        <w:t>エピソードを自動巡回し、</w:t>
+      </w:r>
+      <w:r>
+        <w:rPr>
+          <w:rFonts w:eastAsia="Yu Gothic" w:ascii="Yu Gothic" w:hAnsi="Yu Gothic"/>
+          <w:b w:val="false"/>
+          <w:i w:val="false"/>
+          <w:color w:val="334155"/>
+          <w:sz w:val="20"/>
+        </w:rPr>
+        <w:t>1</w:t>
+      </w:r>
+      <w:r>
+        <w:rPr>
+          <w:rFonts w:ascii="Yu Gothic" w:hAnsi="Yu Gothic" w:eastAsia="Yu Gothic"/>
+          <w:b w:val="false"/>
+          <w:i w:val="false"/>
+          <w:color w:val="334155"/>
+          <w:sz w:val="20"/>
+        </w:rPr>
+        <w:t>エピソードあたり</w:t>
+      </w:r>
+      <w:r>
+        <w:rPr>
+          <w:rFonts w:eastAsia="Yu Gothic" w:ascii="Yu Gothic" w:hAnsi="Yu Gothic"/>
+          <w:b w:val="false"/>
+          <w:i w:val="false"/>
+          <w:color w:val="334155"/>
+          <w:sz w:val="20"/>
+        </w:rPr>
+        <w:t>285</w:t>
+      </w:r>
+      <w:r>
+        <w:rPr>
+          <w:rFonts w:ascii="Yu Gothic" w:hAnsi="Yu Gothic" w:eastAsia="Yu Gothic"/>
+          <w:b w:val="false"/>
+          <w:i w:val="false"/>
+          <w:color w:val="334155"/>
+          <w:sz w:val="20"/>
+        </w:rPr>
+        <w:t>ステップ（約</w:t>
+      </w:r>
+      <w:r>
+        <w:rPr>
+          <w:rFonts w:eastAsia="Yu Gothic" w:ascii="Yu Gothic" w:hAnsi="Yu Gothic"/>
+          <w:b w:val="false"/>
+          <w:i w:val="false"/>
+          <w:color w:val="334155"/>
+          <w:sz w:val="20"/>
+        </w:rPr>
+        <w:t>28.5</w:t>
+      </w:r>
+      <w:r>
+        <w:rPr>
+          <w:rFonts w:ascii="Yu Gothic" w:hAnsi="Yu Gothic" w:eastAsia="Yu Gothic"/>
+          <w:b w:val="false"/>
+          <w:i w:val="false"/>
+          <w:color w:val="334155"/>
+          <w:sz w:val="20"/>
+        </w:rPr>
+        <w:t xml:space="preserve">秒）、総計 </w:t>
+      </w:r>
+      <w:r>
+        <w:rPr>
+          <w:rFonts w:eastAsia="Yu Gothic" w:ascii="Yu Gothic" w:hAnsi="Yu Gothic"/>
+          <w:b w:val="false"/>
+          <w:i w:val="false"/>
+          <w:color w:val="334155"/>
+          <w:sz w:val="20"/>
+        </w:rPr>
+        <w:t xml:space="preserve">2,850 </w:t>
+      </w:r>
+      <w:r>
+        <w:rPr>
+          <w:rFonts w:ascii="Yu Gothic" w:hAnsi="Yu Gothic" w:eastAsia="Yu Gothic"/>
+          <w:b w:val="false"/>
+          <w:i w:val="false"/>
+          <w:color w:val="334155"/>
+          <w:sz w:val="20"/>
+        </w:rPr>
+        <w:t>ステップ（フレーム）の実物理環境データ（接触反力、スリップ、画像オプティカルフロー）を欠損なく</w:t>
+      </w:r>
+      <w:r>
+        <w:rPr>
+          <w:rFonts w:eastAsia="Yu Gothic" w:ascii="Yu Gothic" w:hAnsi="Yu Gothic"/>
+          <w:b w:val="false"/>
+          <w:i w:val="false"/>
+          <w:color w:val="334155"/>
+          <w:sz w:val="20"/>
+        </w:rPr>
+        <w:t>100%</w:t>
+      </w:r>
+      <w:r>
+        <w:rPr>
+          <w:rFonts w:ascii="Yu Gothic" w:hAnsi="Yu Gothic" w:eastAsia="Yu Gothic"/>
+          <w:b w:val="false"/>
+          <w:i w:val="false"/>
+          <w:color w:val="334155"/>
+          <w:sz w:val="20"/>
+        </w:rPr>
+        <w:t>成功で完全記録。</w:t>
+      </w:r>
+    </w:p>
+    <w:p>
+      <w:pPr>
+        <w:pStyle w:val="ListBullet"/>
+        <w:numPr>
+          <w:ilvl w:val="0"/>
+          <w:numId w:val="1"/>
+        </w:numPr>
+        <w:spacing w:lineRule="auto" w:line="300" w:before="20" w:after="60"/>
+        <w:ind w:left="360" w:hanging="360"/>
+        <w:contextualSpacing/>
+        <w:rPr/>
+      </w:pPr>
+      <w:r>
+        <w:rPr>
+          <w:rFonts w:ascii="Yu Gothic" w:hAnsi="Yu Gothic" w:eastAsia="Yu Gothic"/>
+          <w:b/>
+          <w:i w:val="false"/>
+          <w:color w:val="0F172A"/>
+          <w:sz w:val="20"/>
+        </w:rPr>
+        <w:t>数理蒸留データセットによる可動域全体精密グリッド化</w:t>
+      </w:r>
+      <w:r>
+        <w:rPr>
+          <w:rFonts w:eastAsia="Yu Gothic" w:ascii="Yu Gothic" w:hAnsi="Yu Gothic"/>
+          <w:b/>
+          <w:i w:val="false"/>
+          <w:color w:val="0F172A"/>
+          <w:sz w:val="20"/>
+        </w:rPr>
+        <w:t xml:space="preserve">: </w:t>
+      </w:r>
+      <w:r>
+        <w:rPr>
+          <w:rFonts w:ascii="Yu Gothic" w:hAnsi="Yu Gothic" w:eastAsia="Yu Gothic"/>
+          <w:b w:val="false"/>
+          <w:i w:val="false"/>
+          <w:color w:val="334155"/>
+          <w:sz w:val="20"/>
+        </w:rPr>
+        <w:t xml:space="preserve">さらに、生徒モデルが可動域内のどこにペグが置かれても迷わず動作できるよう、アームの到達可能範囲（半径 </w:t>
+      </w:r>
+      <w:r>
+        <w:rPr>
+          <w:rFonts w:eastAsia="Yu Gothic" w:ascii="Yu Gothic" w:hAnsi="Yu Gothic"/>
+          <w:b w:val="false"/>
+          <w:i w:val="false"/>
+          <w:color w:val="334155"/>
+          <w:sz w:val="20"/>
+        </w:rPr>
+        <w:t xml:space="preserve">R=0.12m </w:t>
+      </w:r>
+      <w:r>
+        <w:rPr>
+          <w:rFonts w:ascii="Yu Gothic" w:hAnsi="Yu Gothic" w:eastAsia="Yu Gothic"/>
+          <w:b w:val="false"/>
+          <w:i w:val="false"/>
+          <w:color w:val="334155"/>
+          <w:sz w:val="20"/>
+        </w:rPr>
+        <w:t xml:space="preserve">〜 </w:t>
+      </w:r>
+      <w:r>
+        <w:rPr>
+          <w:rFonts w:eastAsia="Yu Gothic" w:ascii="Yu Gothic" w:hAnsi="Yu Gothic"/>
+          <w:b w:val="false"/>
+          <w:i w:val="false"/>
+          <w:color w:val="334155"/>
+          <w:sz w:val="20"/>
+        </w:rPr>
+        <w:t>0.22m</w:t>
+      </w:r>
+      <w:r>
+        <w:rPr>
+          <w:rFonts w:ascii="Yu Gothic" w:hAnsi="Yu Gothic" w:eastAsia="Yu Gothic"/>
+          <w:b w:val="false"/>
+          <w:i w:val="false"/>
+          <w:color w:val="334155"/>
+          <w:sz w:val="20"/>
+        </w:rPr>
+        <w:t xml:space="preserve">）全体を細かく格子状に分割した </w:t>
+      </w:r>
+      <w:r>
+        <w:rPr>
+          <w:rFonts w:eastAsia="Yu Gothic" w:ascii="Yu Gothic" w:hAnsi="Yu Gothic"/>
+          <w:b w:val="false"/>
+          <w:i w:val="false"/>
+          <w:color w:val="334155"/>
+          <w:sz w:val="20"/>
+        </w:rPr>
+        <w:t>48</w:t>
+      </w:r>
+      <w:r>
+        <w:rPr>
+          <w:rFonts w:ascii="Yu Gothic" w:hAnsi="Yu Gothic" w:eastAsia="Yu Gothic"/>
+          <w:b w:val="false"/>
+          <w:i w:val="false"/>
+          <w:color w:val="334155"/>
+          <w:sz w:val="20"/>
+        </w:rPr>
+        <w:t>パターンの配置（逆サイド</w:t>
+      </w:r>
+      <w:r>
+        <w:rPr>
+          <w:rFonts w:eastAsia="Yu Gothic" w:ascii="Yu Gothic" w:hAnsi="Yu Gothic"/>
+          <w:b w:val="false"/>
+          <w:i w:val="false"/>
+          <w:color w:val="334155"/>
+          <w:sz w:val="20"/>
+        </w:rPr>
+        <w:t>24</w:t>
+      </w:r>
+      <w:r>
+        <w:rPr>
+          <w:rFonts w:ascii="Yu Gothic" w:hAnsi="Yu Gothic" w:eastAsia="Yu Gothic"/>
+          <w:b w:val="false"/>
+          <w:i w:val="false"/>
+          <w:color w:val="334155"/>
+          <w:sz w:val="20"/>
+        </w:rPr>
+        <w:t>、通常サイド</w:t>
+      </w:r>
+      <w:r>
+        <w:rPr>
+          <w:rFonts w:eastAsia="Yu Gothic" w:ascii="Yu Gothic" w:hAnsi="Yu Gothic"/>
+          <w:b w:val="false"/>
+          <w:i w:val="false"/>
+          <w:color w:val="334155"/>
+          <w:sz w:val="20"/>
+        </w:rPr>
+        <w:t>20</w:t>
+      </w:r>
+      <w:r>
+        <w:rPr>
+          <w:rFonts w:ascii="Yu Gothic" w:hAnsi="Yu Gothic" w:eastAsia="Yu Gothic"/>
+          <w:b w:val="false"/>
+          <w:i w:val="false"/>
+          <w:color w:val="334155"/>
+          <w:sz w:val="20"/>
+        </w:rPr>
+        <w:t>、中央</w:t>
+      </w:r>
+      <w:r>
+        <w:rPr>
+          <w:rFonts w:eastAsia="Yu Gothic" w:ascii="Yu Gothic" w:hAnsi="Yu Gothic"/>
+          <w:b w:val="false"/>
+          <w:i w:val="false"/>
+          <w:color w:val="334155"/>
+          <w:sz w:val="20"/>
+        </w:rPr>
+        <w:t>4</w:t>
+      </w:r>
+      <w:r>
+        <w:rPr>
+          <w:rFonts w:ascii="Yu Gothic" w:hAnsi="Yu Gothic" w:eastAsia="Yu Gothic"/>
+          <w:b w:val="false"/>
+          <w:i w:val="false"/>
+          <w:color w:val="334155"/>
+          <w:sz w:val="20"/>
+        </w:rPr>
+        <w:t>）</w:t>
+      </w:r>
+      <w:r>
+        <w:rPr>
+          <w:rFonts w:eastAsia="Yu Gothic" w:ascii="Yu Gothic" w:hAnsi="Yu Gothic"/>
+          <w:b w:val="false"/>
+          <w:i w:val="false"/>
+          <w:color w:val="334155"/>
+          <w:sz w:val="20"/>
+        </w:rPr>
+        <w:t>× 285</w:t>
+      </w:r>
+      <w:r>
+        <w:rPr>
+          <w:rFonts w:ascii="Yu Gothic" w:hAnsi="Yu Gothic" w:eastAsia="Yu Gothic"/>
+          <w:b w:val="false"/>
+          <w:i w:val="false"/>
+          <w:color w:val="334155"/>
+          <w:sz w:val="20"/>
+        </w:rPr>
+        <w:t xml:space="preserve">ステップ ＝ 計 </w:t>
+      </w:r>
+      <w:r>
+        <w:rPr>
+          <w:rFonts w:eastAsia="Yu Gothic" w:ascii="Yu Gothic" w:hAnsi="Yu Gothic"/>
+          <w:b w:val="false"/>
+          <w:i w:val="false"/>
+          <w:color w:val="334155"/>
+          <w:sz w:val="20"/>
+        </w:rPr>
+        <w:t xml:space="preserve">13,680 </w:t>
+      </w:r>
+      <w:r>
+        <w:rPr>
+          <w:rFonts w:ascii="Yu Gothic" w:hAnsi="Yu Gothic" w:eastAsia="Yu Gothic"/>
+          <w:b w:val="false"/>
+          <w:i w:val="false"/>
+          <w:color w:val="334155"/>
+          <w:sz w:val="20"/>
+        </w:rPr>
+        <w:t>ステップ の数理蒸留データセットを展開し、学習の死角を徹底的に排除しました。</w:t>
       </w:r>
     </w:p>
     <w:p>
@@ -5692,22 +6025,32 @@
       </w:pPr>
       <w:r>
         <w:rPr>
-          <w:rFonts w:ascii="Yu Gothic" w:hAnsi="Yu Gothic" w:eastAsia="Yu Gothic"/>
+          <w:rFonts w:eastAsia="Yu Gothic" w:ascii="Yu Gothic" w:hAnsi="Yu Gothic"/>
           <w:b/>
           <w:i w:val="false"/>
           <w:color w:val="0F172A"/>
           <w:sz w:val="20"/>
         </w:rPr>
-        <w:t>データ整合性検証</w:t>
-      </w:r>
-      <w:r>
-        <w:rPr>
-          <w:rFonts w:eastAsia="Yu Gothic" w:ascii="Yu Gothic" w:hAnsi="Yu Gothic"/>
+        <w:t>14</w:t>
+      </w:r>
+      <w:r>
+        <w:rPr>
+          <w:rFonts w:ascii="Yu Gothic" w:hAnsi="Yu Gothic" w:eastAsia="Yu Gothic"/>
           <w:b/>
           <w:i w:val="false"/>
           <w:color w:val="0F172A"/>
           <w:sz w:val="20"/>
         </w:rPr>
+        <w:t>次元アフォーダンス特徴量の機能別説明</w:t>
+      </w:r>
+      <w:r>
+        <w:rPr>
+          <w:rFonts w:eastAsia="Yu Gothic" w:ascii="Yu Gothic" w:hAnsi="Yu Gothic"/>
+          <w:b/>
+          <w:i w:val="false"/>
+          <w:color w:val="0F172A"/>
+          <w:sz w:val="20"/>
+        </w:rPr>
         <w:t xml:space="preserve">: </w:t>
       </w:r>
       <w:r>
@@ -5718,27 +6061,7 @@
           <w:color w:val="334155"/>
           <w:sz w:val="20"/>
         </w:rPr>
-        <w:t>収集された画像解像度（</w:t>
-      </w:r>
-      <w:r>
-        <w:rPr>
-          <w:rFonts w:eastAsia="Yu Gothic" w:ascii="Yu Gothic" w:hAnsi="Yu Gothic"/>
-          <w:b w:val="false"/>
-          <w:i w:val="false"/>
-          <w:color w:val="334155"/>
-          <w:sz w:val="20"/>
-        </w:rPr>
-        <w:t>224x224 RGB</w:t>
-      </w:r>
-      <w:r>
-        <w:rPr>
-          <w:rFonts w:ascii="Yu Gothic" w:hAnsi="Yu Gothic" w:eastAsia="Yu Gothic"/>
-          <w:b w:val="false"/>
-          <w:i w:val="false"/>
-          <w:color w:val="334155"/>
-          <w:sz w:val="20"/>
-        </w:rPr>
-        <w:t>）、</w:t>
+        <w:t>画像や関節角に加えてモデルに入力する『</w:t>
       </w:r>
       <w:r>
         <w:rPr>
@@ -5758,27 +6081,539 @@
           <w:color w:val="334155"/>
           <w:sz w:val="20"/>
         </w:rPr>
-        <w:t>次元特徴量ベクトルの欠損値（</w:t>
-      </w:r>
-      <w:r>
-        <w:rPr>
-          <w:rFonts w:eastAsia="Yu Gothic" w:ascii="Yu Gothic" w:hAnsi="Yu Gothic"/>
-          <w:b w:val="false"/>
-          <w:i w:val="false"/>
-          <w:color w:val="334155"/>
-          <w:sz w:val="20"/>
-        </w:rPr>
-        <w:t>NaN/Inf</w:t>
-      </w:r>
-      <w:r>
-        <w:rPr>
-          <w:rFonts w:ascii="Yu Gothic" w:hAnsi="Yu Gothic" w:eastAsia="Yu Gothic"/>
-          <w:b w:val="false"/>
-          <w:i w:val="false"/>
-          <w:color w:val="334155"/>
-          <w:sz w:val="20"/>
-        </w:rPr>
-        <w:t>）ゼロ確認、値域整合性を完全点検。</w:t>
+        <w:t>次元特徴量』の構成を点検しました。数値の丸暗記ではなく、ロボットが状況を正しく把握するための</w:t>
+      </w:r>
+      <w:r>
+        <w:rPr>
+          <w:rFonts w:eastAsia="Yu Gothic" w:ascii="Yu Gothic" w:hAnsi="Yu Gothic"/>
+          <w:b w:val="false"/>
+          <w:i w:val="false"/>
+          <w:color w:val="334155"/>
+          <w:sz w:val="20"/>
+        </w:rPr>
+        <w:t>4</w:t>
+      </w:r>
+      <w:r>
+        <w:rPr>
+          <w:rFonts w:ascii="Yu Gothic" w:hAnsi="Yu Gothic" w:eastAsia="Yu Gothic"/>
+          <w:b w:val="false"/>
+          <w:i w:val="false"/>
+          <w:color w:val="334155"/>
+          <w:sz w:val="20"/>
+        </w:rPr>
+        <w:t>つの役割に整理されています：</w:t>
+      </w:r>
+    </w:p>
+    <w:p>
+      <w:pPr>
+        <w:pStyle w:val="ListBullet"/>
+        <w:numPr>
+          <w:ilvl w:val="0"/>
+          <w:numId w:val="1"/>
+        </w:numPr>
+        <w:spacing w:lineRule="auto" w:line="300" w:before="20" w:after="60"/>
+        <w:ind w:left="720" w:hanging="360"/>
+        <w:contextualSpacing/>
+        <w:rPr/>
+      </w:pPr>
+      <w:r>
+        <w:rPr>
+          <w:rFonts w:eastAsia="Yu Gothic" w:ascii="Yu Gothic" w:hAnsi="Yu Gothic"/>
+          <w:b/>
+          <w:i w:val="false"/>
+          <w:color w:val="0F172A"/>
+          <w:sz w:val="20"/>
+        </w:rPr>
+        <w:t xml:space="preserve">1. </w:t>
+      </w:r>
+      <w:r>
+        <w:rPr>
+          <w:rFonts w:ascii="Yu Gothic" w:hAnsi="Yu Gothic" w:eastAsia="Yu Gothic"/>
+          <w:b/>
+          <w:i w:val="false"/>
+          <w:color w:val="0F172A"/>
+          <w:sz w:val="20"/>
+        </w:rPr>
+        <w:t xml:space="preserve">極座標幾何特徴 </w:t>
+      </w:r>
+      <w:r>
+        <w:rPr>
+          <w:rFonts w:eastAsia="Yu Gothic" w:ascii="Yu Gothic" w:hAnsi="Yu Gothic"/>
+          <w:b/>
+          <w:i w:val="false"/>
+          <w:color w:val="0F172A"/>
+          <w:sz w:val="20"/>
+        </w:rPr>
+        <w:t>(2</w:t>
+      </w:r>
+      <w:r>
+        <w:rPr>
+          <w:rFonts w:ascii="Yu Gothic" w:hAnsi="Yu Gothic" w:eastAsia="Yu Gothic"/>
+          <w:b/>
+          <w:i w:val="false"/>
+          <w:color w:val="0F172A"/>
+          <w:sz w:val="20"/>
+        </w:rPr>
+        <w:t>次元</w:t>
+      </w:r>
+      <w:r>
+        <w:rPr>
+          <w:rFonts w:eastAsia="Yu Gothic" w:ascii="Yu Gothic" w:hAnsi="Yu Gothic"/>
+          <w:b/>
+          <w:i w:val="false"/>
+          <w:color w:val="0F172A"/>
+          <w:sz w:val="20"/>
+        </w:rPr>
+        <w:t xml:space="preserve">: </w:t>
+      </w:r>
+      <w:r>
+        <w:rPr>
+          <w:rFonts w:ascii="Yu Gothic" w:hAnsi="Yu Gothic" w:eastAsia="Yu Gothic"/>
+          <w:b/>
+          <w:i w:val="false"/>
+          <w:color w:val="0F172A"/>
+          <w:sz w:val="20"/>
+        </w:rPr>
+        <w:t xml:space="preserve">半径 </w:t>
+      </w:r>
+      <w:r>
+        <w:rPr>
+          <w:rFonts w:eastAsia="Yu Gothic" w:ascii="Yu Gothic" w:hAnsi="Yu Gothic"/>
+          <w:b/>
+          <w:i w:val="false"/>
+          <w:color w:val="0F172A"/>
+          <w:sz w:val="20"/>
+        </w:rPr>
+        <w:t xml:space="preserve">r, </w:t>
+      </w:r>
+      <w:r>
+        <w:rPr>
+          <w:rFonts w:ascii="Yu Gothic" w:hAnsi="Yu Gothic" w:eastAsia="Yu Gothic"/>
+          <w:b/>
+          <w:i w:val="false"/>
+          <w:color w:val="0F172A"/>
+          <w:sz w:val="20"/>
+        </w:rPr>
+        <w:t xml:space="preserve">旋回角 </w:t>
+      </w:r>
+      <w:r>
+        <w:rPr>
+          <w:rFonts w:eastAsia="Yu Gothic" w:ascii="Yu Gothic" w:hAnsi="Yu Gothic"/>
+          <w:b/>
+          <w:i w:val="false"/>
+          <w:color w:val="0F172A"/>
+          <w:sz w:val="20"/>
+        </w:rPr>
+        <w:t xml:space="preserve">theta): </w:t>
+      </w:r>
+      <w:r>
+        <w:rPr>
+          <w:rFonts w:ascii="Yu Gothic" w:hAnsi="Yu Gothic" w:eastAsia="Yu Gothic"/>
+          <w:b w:val="false"/>
+          <w:i w:val="false"/>
+          <w:color w:val="334155"/>
+          <w:sz w:val="20"/>
+        </w:rPr>
+        <w:t>ロボットの根本の旋回軸（</w:t>
+      </w:r>
+      <w:r>
+        <w:rPr>
+          <w:rFonts w:eastAsia="Yu Gothic" w:ascii="Yu Gothic" w:hAnsi="Yu Gothic"/>
+          <w:b w:val="false"/>
+          <w:i w:val="false"/>
+          <w:color w:val="334155"/>
+          <w:sz w:val="20"/>
+        </w:rPr>
+        <w:t>J1</w:t>
+      </w:r>
+      <w:r>
+        <w:rPr>
+          <w:rFonts w:ascii="Yu Gothic" w:hAnsi="Yu Gothic" w:eastAsia="Yu Gothic"/>
+          <w:b w:val="false"/>
+          <w:i w:val="false"/>
+          <w:color w:val="334155"/>
+          <w:sz w:val="20"/>
+        </w:rPr>
+        <w:t>）と腕の伸び具合に直結する距離と角度。逆運動学の複雑な非線形計算を肩代わりします。</w:t>
+      </w:r>
+    </w:p>
+    <w:p>
+      <w:pPr>
+        <w:pStyle w:val="ListBullet"/>
+        <w:numPr>
+          <w:ilvl w:val="0"/>
+          <w:numId w:val="1"/>
+        </w:numPr>
+        <w:spacing w:lineRule="auto" w:line="300" w:before="20" w:after="60"/>
+        <w:ind w:left="720" w:hanging="360"/>
+        <w:contextualSpacing/>
+        <w:rPr/>
+      </w:pPr>
+      <w:r>
+        <w:rPr>
+          <w:rFonts w:eastAsia="Yu Gothic" w:ascii="Yu Gothic" w:hAnsi="Yu Gothic"/>
+          <w:b/>
+          <w:i w:val="false"/>
+          <w:color w:val="0F172A"/>
+          <w:sz w:val="20"/>
+        </w:rPr>
+        <w:t xml:space="preserve">2. </w:t>
+      </w:r>
+      <w:r>
+        <w:rPr>
+          <w:rFonts w:ascii="Yu Gothic" w:hAnsi="Yu Gothic" w:eastAsia="Yu Gothic"/>
+          <w:b/>
+          <w:i w:val="false"/>
+          <w:color w:val="0F172A"/>
+          <w:sz w:val="20"/>
+        </w:rPr>
+        <w:t xml:space="preserve">直交座標・空間相対変位 </w:t>
+      </w:r>
+      <w:r>
+        <w:rPr>
+          <w:rFonts w:eastAsia="Yu Gothic" w:ascii="Yu Gothic" w:hAnsi="Yu Gothic"/>
+          <w:b/>
+          <w:i w:val="false"/>
+          <w:color w:val="0F172A"/>
+          <w:sz w:val="20"/>
+        </w:rPr>
+        <w:t>(8</w:t>
+      </w:r>
+      <w:r>
+        <w:rPr>
+          <w:rFonts w:ascii="Yu Gothic" w:hAnsi="Yu Gothic" w:eastAsia="Yu Gothic"/>
+          <w:b/>
+          <w:i w:val="false"/>
+          <w:color w:val="0F172A"/>
+          <w:sz w:val="20"/>
+        </w:rPr>
+        <w:t>次元</w:t>
+      </w:r>
+      <w:r>
+        <w:rPr>
+          <w:rFonts w:eastAsia="Yu Gothic" w:ascii="Yu Gothic" w:hAnsi="Yu Gothic"/>
+          <w:b/>
+          <w:i w:val="false"/>
+          <w:color w:val="0F172A"/>
+          <w:sz w:val="20"/>
+        </w:rPr>
+        <w:t xml:space="preserve">: </w:t>
+      </w:r>
+      <w:r>
+        <w:rPr>
+          <w:rFonts w:ascii="Yu Gothic" w:hAnsi="Yu Gothic" w:eastAsia="Yu Gothic"/>
+          <w:b/>
+          <w:i w:val="false"/>
+          <w:color w:val="0F172A"/>
+          <w:sz w:val="20"/>
+        </w:rPr>
+        <w:t xml:space="preserve">ペグ位置 </w:t>
+      </w:r>
+      <w:r>
+        <w:rPr>
+          <w:rFonts w:eastAsia="Yu Gothic" w:ascii="Yu Gothic" w:hAnsi="Yu Gothic"/>
+          <w:b/>
+          <w:i w:val="false"/>
+          <w:color w:val="0F172A"/>
+          <w:sz w:val="20"/>
+        </w:rPr>
+        <w:t>X, Y</w:t>
+      </w:r>
+      <w:r>
+        <w:rPr>
+          <w:rFonts w:ascii="Yu Gothic" w:hAnsi="Yu Gothic" w:eastAsia="Yu Gothic"/>
+          <w:b/>
+          <w:i w:val="false"/>
+          <w:color w:val="0F172A"/>
+          <w:sz w:val="20"/>
+        </w:rPr>
+        <w:t xml:space="preserve">、穴位置 </w:t>
+      </w:r>
+      <w:r>
+        <w:rPr>
+          <w:rFonts w:eastAsia="Yu Gothic" w:ascii="Yu Gothic" w:hAnsi="Yu Gothic"/>
+          <w:b/>
+          <w:i w:val="false"/>
+          <w:color w:val="0F172A"/>
+          <w:sz w:val="20"/>
+        </w:rPr>
+        <w:t>X, Y</w:t>
+      </w:r>
+      <w:r>
+        <w:rPr>
+          <w:rFonts w:ascii="Yu Gothic" w:hAnsi="Yu Gothic" w:eastAsia="Yu Gothic"/>
+          <w:b/>
+          <w:i w:val="false"/>
+          <w:color w:val="0F172A"/>
+          <w:sz w:val="20"/>
+        </w:rPr>
+        <w:t xml:space="preserve">、相対差分 </w:t>
+      </w:r>
+      <w:r>
+        <w:rPr>
+          <w:rFonts w:eastAsia="Yu Gothic" w:ascii="Yu Gothic" w:hAnsi="Yu Gothic"/>
+          <w:b/>
+          <w:i w:val="false"/>
+          <w:color w:val="0F172A"/>
+          <w:sz w:val="20"/>
+        </w:rPr>
+        <w:t>dX, dY</w:t>
+      </w:r>
+      <w:r>
+        <w:rPr>
+          <w:rFonts w:ascii="Yu Gothic" w:hAnsi="Yu Gothic" w:eastAsia="Yu Gothic"/>
+          <w:b/>
+          <w:i w:val="false"/>
+          <w:color w:val="0F172A"/>
+          <w:sz w:val="20"/>
+        </w:rPr>
+        <w:t>、直線距離</w:t>
+      </w:r>
+      <w:r>
+        <w:rPr>
+          <w:rFonts w:eastAsia="Yu Gothic" w:ascii="Yu Gothic" w:hAnsi="Yu Gothic"/>
+          <w:b/>
+          <w:i w:val="false"/>
+          <w:color w:val="0F172A"/>
+          <w:sz w:val="20"/>
+        </w:rPr>
+        <w:t xml:space="preserve">): </w:t>
+      </w:r>
+      <w:r>
+        <w:rPr>
+          <w:rFonts w:ascii="Yu Gothic" w:hAnsi="Yu Gothic" w:eastAsia="Yu Gothic"/>
+          <w:b w:val="false"/>
+          <w:i w:val="false"/>
+          <w:color w:val="334155"/>
+          <w:sz w:val="20"/>
+        </w:rPr>
+        <w:t>ペグがどこにあっても受台穴へ向かって運ぶための『ゴールへの方向と残り距離』を示す空間情報。</w:t>
+      </w:r>
+    </w:p>
+    <w:p>
+      <w:pPr>
+        <w:pStyle w:val="ListBullet"/>
+        <w:numPr>
+          <w:ilvl w:val="0"/>
+          <w:numId w:val="1"/>
+        </w:numPr>
+        <w:spacing w:lineRule="auto" w:line="300" w:before="20" w:after="60"/>
+        <w:ind w:left="720" w:hanging="360"/>
+        <w:contextualSpacing/>
+        <w:rPr/>
+      </w:pPr>
+      <w:r>
+        <w:rPr>
+          <w:rFonts w:eastAsia="Yu Gothic" w:ascii="Yu Gothic" w:hAnsi="Yu Gothic"/>
+          <w:b/>
+          <w:i w:val="false"/>
+          <w:color w:val="0F172A"/>
+          <w:sz w:val="20"/>
+        </w:rPr>
+        <w:t xml:space="preserve">3. </w:t>
+      </w:r>
+      <w:r>
+        <w:rPr>
+          <w:rFonts w:ascii="Yu Gothic" w:hAnsi="Yu Gothic" w:eastAsia="Yu Gothic"/>
+          <w:b/>
+          <w:i w:val="false"/>
+          <w:color w:val="0F172A"/>
+          <w:sz w:val="20"/>
+        </w:rPr>
+        <w:t xml:space="preserve">タスク進行度・物理動作フェーズ </w:t>
+      </w:r>
+      <w:r>
+        <w:rPr>
+          <w:rFonts w:eastAsia="Yu Gothic" w:ascii="Yu Gothic" w:hAnsi="Yu Gothic"/>
+          <w:b/>
+          <w:i w:val="false"/>
+          <w:color w:val="0F172A"/>
+          <w:sz w:val="20"/>
+        </w:rPr>
+        <w:t>(2</w:t>
+      </w:r>
+      <w:r>
+        <w:rPr>
+          <w:rFonts w:ascii="Yu Gothic" w:hAnsi="Yu Gothic" w:eastAsia="Yu Gothic"/>
+          <w:b/>
+          <w:i w:val="false"/>
+          <w:color w:val="0F172A"/>
+          <w:sz w:val="20"/>
+        </w:rPr>
+        <w:t>次元</w:t>
+      </w:r>
+      <w:r>
+        <w:rPr>
+          <w:rFonts w:eastAsia="Yu Gothic" w:ascii="Yu Gothic" w:hAnsi="Yu Gothic"/>
+          <w:b/>
+          <w:i w:val="false"/>
+          <w:color w:val="0F172A"/>
+          <w:sz w:val="20"/>
+        </w:rPr>
+        <w:t xml:space="preserve">: </w:t>
+      </w:r>
+      <w:r>
+        <w:rPr>
+          <w:rFonts w:ascii="Yu Gothic" w:hAnsi="Yu Gothic" w:eastAsia="Yu Gothic"/>
+          <w:b/>
+          <w:i w:val="false"/>
+          <w:color w:val="0F172A"/>
+          <w:sz w:val="20"/>
+        </w:rPr>
+        <w:t xml:space="preserve">進行度 </w:t>
+      </w:r>
+      <w:r>
+        <w:rPr>
+          <w:rFonts w:eastAsia="Yu Gothic" w:ascii="Yu Gothic" w:hAnsi="Yu Gothic"/>
+          <w:b/>
+          <w:i w:val="false"/>
+          <w:color w:val="0F172A"/>
+          <w:sz w:val="20"/>
+        </w:rPr>
+        <w:t>tau</w:t>
+      </w:r>
+      <w:r>
+        <w:rPr>
+          <w:rFonts w:ascii="Yu Gothic" w:hAnsi="Yu Gothic" w:eastAsia="Yu Gothic"/>
+          <w:b/>
+          <w:i w:val="false"/>
+          <w:color w:val="0F172A"/>
+          <w:sz w:val="20"/>
+        </w:rPr>
+        <w:t>、フェーズ指標</w:t>
+      </w:r>
+      <w:r>
+        <w:rPr>
+          <w:rFonts w:eastAsia="Yu Gothic" w:ascii="Yu Gothic" w:hAnsi="Yu Gothic"/>
+          <w:b/>
+          <w:i w:val="false"/>
+          <w:color w:val="0F172A"/>
+          <w:sz w:val="20"/>
+        </w:rPr>
+        <w:t xml:space="preserve">): </w:t>
+      </w:r>
+      <w:r>
+        <w:rPr>
+          <w:rFonts w:ascii="Yu Gothic" w:hAnsi="Yu Gothic" w:eastAsia="Yu Gothic"/>
+          <w:b w:val="false"/>
+          <w:i w:val="false"/>
+          <w:color w:val="334155"/>
+          <w:sz w:val="20"/>
+        </w:rPr>
+        <w:t>『接近・把持・浮上・巡航・圧入・解放』という一連の流れのどこを実行しているかを示し、動作の混同や立ち往生を防ぎます。</w:t>
+      </w:r>
+    </w:p>
+    <w:p>
+      <w:pPr>
+        <w:pStyle w:val="ListBullet"/>
+        <w:numPr>
+          <w:ilvl w:val="0"/>
+          <w:numId w:val="1"/>
+        </w:numPr>
+        <w:spacing w:lineRule="auto" w:line="300" w:before="20" w:after="60"/>
+        <w:ind w:left="720" w:hanging="360"/>
+        <w:contextualSpacing/>
+        <w:rPr/>
+      </w:pPr>
+      <w:r>
+        <w:rPr>
+          <w:rFonts w:eastAsia="Yu Gothic" w:ascii="Yu Gothic" w:hAnsi="Yu Gothic"/>
+          <w:b/>
+          <w:i w:val="false"/>
+          <w:color w:val="0F172A"/>
+          <w:sz w:val="20"/>
+        </w:rPr>
+        <w:t xml:space="preserve">4. </w:t>
+      </w:r>
+      <w:r>
+        <w:rPr>
+          <w:rFonts w:ascii="Yu Gothic" w:hAnsi="Yu Gothic" w:eastAsia="Yu Gothic"/>
+          <w:b/>
+          <w:i w:val="false"/>
+          <w:color w:val="0F172A"/>
+          <w:sz w:val="20"/>
+        </w:rPr>
+        <w:t xml:space="preserve">把持・浮上アフォーダンス状態フラグ </w:t>
+      </w:r>
+      <w:r>
+        <w:rPr>
+          <w:rFonts w:eastAsia="Yu Gothic" w:ascii="Yu Gothic" w:hAnsi="Yu Gothic"/>
+          <w:b/>
+          <w:i w:val="false"/>
+          <w:color w:val="0F172A"/>
+          <w:sz w:val="20"/>
+        </w:rPr>
+        <w:t>(2</w:t>
+      </w:r>
+      <w:r>
+        <w:rPr>
+          <w:rFonts w:ascii="Yu Gothic" w:hAnsi="Yu Gothic" w:eastAsia="Yu Gothic"/>
+          <w:b/>
+          <w:i w:val="false"/>
+          <w:color w:val="0F172A"/>
+          <w:sz w:val="20"/>
+        </w:rPr>
+        <w:t>次元</w:t>
+      </w:r>
+      <w:r>
+        <w:rPr>
+          <w:rFonts w:eastAsia="Yu Gothic" w:ascii="Yu Gothic" w:hAnsi="Yu Gothic"/>
+          <w:b/>
+          <w:i w:val="false"/>
+          <w:color w:val="0F172A"/>
+          <w:sz w:val="20"/>
+        </w:rPr>
+        <w:t xml:space="preserve">: </w:t>
+      </w:r>
+      <w:r>
+        <w:rPr>
+          <w:rFonts w:ascii="Yu Gothic" w:hAnsi="Yu Gothic" w:eastAsia="Yu Gothic"/>
+          <w:b/>
+          <w:i w:val="false"/>
+          <w:color w:val="0F172A"/>
+          <w:sz w:val="20"/>
+        </w:rPr>
+        <w:t>把持状態フラグ、</w:t>
+      </w:r>
+      <w:r>
+        <w:rPr>
+          <w:rFonts w:eastAsia="Yu Gothic" w:ascii="Yu Gothic" w:hAnsi="Yu Gothic"/>
+          <w:b/>
+          <w:i w:val="false"/>
+          <w:color w:val="0F172A"/>
+          <w:sz w:val="20"/>
+        </w:rPr>
+        <w:t>Side</w:t>
+      </w:r>
+      <w:r>
+        <w:rPr>
+          <w:rFonts w:ascii="Yu Gothic" w:hAnsi="Yu Gothic" w:eastAsia="Yu Gothic"/>
+          <w:b/>
+          <w:i w:val="false"/>
+          <w:color w:val="0F172A"/>
+          <w:sz w:val="20"/>
+        </w:rPr>
+        <w:t>カメラ浮上完了フラグ</w:t>
+      </w:r>
+      <w:r>
+        <w:rPr>
+          <w:rFonts w:eastAsia="Yu Gothic" w:ascii="Yu Gothic" w:hAnsi="Yu Gothic"/>
+          <w:b/>
+          <w:i w:val="false"/>
+          <w:color w:val="0F172A"/>
+          <w:sz w:val="20"/>
+        </w:rPr>
+        <w:t xml:space="preserve">): </w:t>
+      </w:r>
+      <w:r>
+        <w:rPr>
+          <w:rFonts w:ascii="Yu Gothic" w:hAnsi="Yu Gothic" w:eastAsia="Yu Gothic"/>
+          <w:b w:val="false"/>
+          <w:i w:val="false"/>
+          <w:color w:val="334155"/>
+          <w:sz w:val="20"/>
+        </w:rPr>
+        <w:t>ペグをしっかり挟持しているか、机から離れて安全に運べる状態かを保証する判定信号。</w:t>
       </w:r>
     </w:p>
     <w:p>
@@ -5801,7 +6636,7 @@
           <w:color w:val="0F172A"/>
           <w:sz w:val="20"/>
         </w:rPr>
-        <w:t>特徴空間分布検証</w:t>
+        <w:t>データ品質点検結果</w:t>
       </w:r>
       <w:r>
         <w:rPr>
@@ -5821,7 +6656,67 @@
           <w:color w:val="334155"/>
           <w:sz w:val="20"/>
         </w:rPr>
-        <w:t>各関節角度およびグリッパー開度のヒストグラム、相関行列ヒートマップを生成し、特異点やデッドロックが存在しないことを確認。</w:t>
+        <w:t>全</w:t>
+      </w:r>
+      <w:r>
+        <w:rPr>
+          <w:rFonts w:eastAsia="Yu Gothic" w:ascii="Yu Gothic" w:hAnsi="Yu Gothic"/>
+          <w:b w:val="false"/>
+          <w:i w:val="false"/>
+          <w:color w:val="334155"/>
+          <w:sz w:val="20"/>
+        </w:rPr>
+        <w:t>2,850</w:t>
+      </w:r>
+      <w:r>
+        <w:rPr>
+          <w:rFonts w:ascii="Yu Gothic" w:hAnsi="Yu Gothic" w:eastAsia="Yu Gothic"/>
+          <w:b w:val="false"/>
+          <w:i w:val="false"/>
+          <w:color w:val="334155"/>
+          <w:sz w:val="20"/>
+        </w:rPr>
+        <w:t>フレームにおいて欠損値（</w:t>
+      </w:r>
+      <w:r>
+        <w:rPr>
+          <w:rFonts w:eastAsia="Yu Gothic" w:ascii="Yu Gothic" w:hAnsi="Yu Gothic"/>
+          <w:b w:val="false"/>
+          <w:i w:val="false"/>
+          <w:color w:val="334155"/>
+          <w:sz w:val="20"/>
+        </w:rPr>
+        <w:t>NaN/Inf</w:t>
+      </w:r>
+      <w:r>
+        <w:rPr>
+          <w:rFonts w:ascii="Yu Gothic" w:hAnsi="Yu Gothic" w:eastAsia="Yu Gothic"/>
+          <w:b w:val="false"/>
+          <w:i w:val="false"/>
+          <w:color w:val="334155"/>
+          <w:sz w:val="20"/>
+        </w:rPr>
+        <w:t>）がゼロであることを確認し、特異点や偏りのない滑らかな学習分布が形成されていることを検証しました（図</w:t>
+      </w:r>
+      <w:r>
+        <w:rPr>
+          <w:rFonts w:eastAsia="Yu Gothic" w:ascii="Yu Gothic" w:hAnsi="Yu Gothic"/>
+          <w:b w:val="false"/>
+          <w:i w:val="false"/>
+          <w:color w:val="334155"/>
+          <w:sz w:val="20"/>
+        </w:rPr>
+        <w:t>5</w:t>
+      </w:r>
+      <w:r>
+        <w:rPr>
+          <w:rFonts w:ascii="Yu Gothic" w:hAnsi="Yu Gothic" w:eastAsia="Yu Gothic"/>
+          <w:b w:val="false"/>
+          <w:i w:val="false"/>
+          <w:color w:val="334155"/>
+          <w:sz w:val="20"/>
+        </w:rPr>
+        <w:t>）。</w:t>
       </w:r>
     </w:p>
     <w:p>
@@ -6007,7 +6902,7 @@
           <w:color w:val="0F172A"/>
           <w:sz w:val="20"/>
         </w:rPr>
-        <w:t>（ショートカット破壊）</w:t>
+        <w:t>（近道学習の遮断）</w:t>
       </w:r>
       <w:r>
         <w:rPr>
@@ -6027,7 +6922,7 @@
           <w:color w:val="334155"/>
           <w:sz w:val="20"/>
         </w:rPr>
-        <w:t xml:space="preserve">入力される現在関節角 </w:t>
+        <w:t xml:space="preserve">関節角度だけに頼って画像を無視してしまう『手抜き学習（過学習）』を防ぐため、入力される現在関節角 </w:t>
       </w:r>
       <w:r>
         <w:rPr>
@@ -6067,7 +6962,27 @@
           <w:color w:val="334155"/>
           <w:sz w:val="20"/>
         </w:rPr>
-        <w:t>を学習時にランダムゼロマスク。視覚情報を無視した関節角度の恒等写像（過学習）を強制遮断。</w:t>
+        <w:t>を学習時にランダムゼロマスク。画像と</w:t>
+      </w:r>
+      <w:r>
+        <w:rPr>
+          <w:rFonts w:eastAsia="Yu Gothic" w:ascii="Yu Gothic" w:hAnsi="Yu Gothic"/>
+          <w:b w:val="false"/>
+          <w:i w:val="false"/>
+          <w:color w:val="334155"/>
+          <w:sz w:val="20"/>
+        </w:rPr>
+        <w:t>14</w:t>
+      </w:r>
+      <w:r>
+        <w:rPr>
+          <w:rFonts w:ascii="Yu Gothic" w:hAnsi="Yu Gothic" w:eastAsia="Yu Gothic"/>
+          <w:b w:val="false"/>
+          <w:i w:val="false"/>
+          <w:color w:val="334155"/>
+          <w:sz w:val="20"/>
+        </w:rPr>
+        <w:t>次元特徴量をしっかり見て判断するよう強制しました。</w:t>
       </w:r>
     </w:p>
     <w:p>
@@ -6110,107 +7025,7 @@
           <w:color w:val="334155"/>
           <w:sz w:val="20"/>
         </w:rPr>
-        <w:t xml:space="preserve">把持座標 </w:t>
-      </w:r>
-      <w:r>
-        <w:rPr>
-          <w:rFonts w:eastAsia="Yu Gothic" w:ascii="Yu Gothic" w:hAnsi="Yu Gothic"/>
-          <w:b w:val="false"/>
-          <w:i w:val="false"/>
-          <w:color w:val="334155"/>
-          <w:sz w:val="20"/>
-        </w:rPr>
-        <w:t xml:space="preserve">(X, Y) </w:t>
-      </w:r>
-      <w:r>
-        <w:rPr>
-          <w:rFonts w:ascii="Yu Gothic" w:hAnsi="Yu Gothic" w:eastAsia="Yu Gothic"/>
-          <w:b w:val="false"/>
-          <w:i w:val="false"/>
-          <w:color w:val="334155"/>
-          <w:sz w:val="20"/>
-        </w:rPr>
-        <w:t xml:space="preserve">を </w:t>
-      </w:r>
-      <w:r>
-        <w:rPr>
-          <w:rFonts w:eastAsia="Yu Gothic" w:ascii="Yu Gothic" w:hAnsi="Yu Gothic"/>
-          <w:b w:val="false"/>
-          <w:i w:val="false"/>
-          <w:color w:val="334155"/>
-          <w:sz w:val="20"/>
-        </w:rPr>
-        <w:t xml:space="preserve">Y &lt; 0 </w:t>
-      </w:r>
-      <w:r>
-        <w:rPr>
-          <w:rFonts w:ascii="Yu Gothic" w:hAnsi="Yu Gothic" w:eastAsia="Yu Gothic"/>
-          <w:b w:val="false"/>
-          <w:i w:val="false"/>
-          <w:color w:val="334155"/>
-          <w:sz w:val="20"/>
-        </w:rPr>
-        <w:t xml:space="preserve">だけでなく原点 </w:t>
-      </w:r>
-      <w:r>
-        <w:rPr>
-          <w:rFonts w:eastAsia="Yu Gothic" w:ascii="Yu Gothic" w:hAnsi="Yu Gothic"/>
-          <w:b w:val="false"/>
-          <w:i w:val="false"/>
-          <w:color w:val="334155"/>
-          <w:sz w:val="20"/>
-        </w:rPr>
-        <w:t xml:space="preserve">(0, 0) </w:t>
-      </w:r>
-      <w:r>
-        <w:rPr>
-          <w:rFonts w:ascii="Yu Gothic" w:hAnsi="Yu Gothic" w:eastAsia="Yu Gothic"/>
-          <w:b w:val="false"/>
-          <w:i w:val="false"/>
-          <w:color w:val="334155"/>
-          <w:sz w:val="20"/>
-        </w:rPr>
-        <w:t xml:space="preserve">を超える </w:t>
-      </w:r>
-      <w:r>
-        <w:rPr>
-          <w:rFonts w:eastAsia="Yu Gothic" w:ascii="Yu Gothic" w:hAnsi="Yu Gothic"/>
-          <w:b w:val="false"/>
-          <w:i w:val="false"/>
-          <w:color w:val="334155"/>
-          <w:sz w:val="20"/>
-        </w:rPr>
-        <w:t xml:space="preserve">Y &gt;= 0 </w:t>
-      </w:r>
-      <w:r>
-        <w:rPr>
-          <w:rFonts w:ascii="Yu Gothic" w:hAnsi="Yu Gothic" w:eastAsia="Yu Gothic"/>
-          <w:b w:val="false"/>
-          <w:i w:val="false"/>
-          <w:color w:val="334155"/>
-          <w:sz w:val="20"/>
-        </w:rPr>
-        <w:t>全域へ連続摂動させ、</w:t>
-      </w:r>
-      <w:r>
-        <w:rPr>
-          <w:rFonts w:eastAsia="Yu Gothic" w:ascii="Yu Gothic" w:hAnsi="Yu Gothic"/>
-          <w:b w:val="false"/>
-          <w:i w:val="false"/>
-          <w:color w:val="334155"/>
-          <w:sz w:val="20"/>
-        </w:rPr>
-        <w:t>IK</w:t>
-      </w:r>
-      <w:r>
-        <w:rPr>
-          <w:rFonts w:ascii="Yu Gothic" w:hAnsi="Yu Gothic" w:eastAsia="Yu Gothic"/>
-          <w:b w:val="false"/>
-          <w:i w:val="false"/>
-          <w:color w:val="334155"/>
-          <w:sz w:val="20"/>
-        </w:rPr>
-        <w:t>を再計算してデータセットを動的拡張。</w:t>
+        <w:t>把持位置を左右広範囲に摂動させ、どんな位置でも対応できるようにデータを拡張。</w:t>
       </w:r>
     </w:p>
     <w:p>
@@ -6449,7 +7264,7 @@
           <w:color w:val="334155"/>
           <w:sz w:val="20"/>
         </w:rPr>
-        <w:t>初期人手</w:t>
+        <w:t>初期の人手</w:t>
       </w:r>
       <w:r>
         <w:rPr>
@@ -6469,7 +7284,7 @@
           <w:color w:val="334155"/>
           <w:sz w:val="20"/>
         </w:rPr>
-        <w:t>（成功率</w:t>
+        <w:t>モデル（成功率</w:t>
       </w:r>
       <w:r>
         <w:rPr>
@@ -6549,7 +7364,7 @@
           <w:color w:val="334155"/>
           <w:sz w:val="20"/>
         </w:rPr>
-        <w:t>を達成（図</w:t>
+        <w:t>という圧倒的な性能向上を達成（図</w:t>
       </w:r>
       <w:r>
         <w:rPr>
@@ -7353,7 +8168,7 @@
           <w:color w:val="0F172A"/>
           <w:sz w:val="20"/>
         </w:rPr>
-        <w:t>ターゲット色選択と妨害物体無視</w:t>
+        <w:t>ターゲット色選択と妨害物体無視（探索と動作の分離）</w:t>
       </w:r>
       <w:r>
         <w:rPr>
@@ -7373,7 +8188,7 @@
           <w:color w:val="334155"/>
           <w:sz w:val="20"/>
         </w:rPr>
-        <w:t>双眼カメラが赤・緑双方を視野内に捉えた状態で、ターゲット指定色（赤）のみをロックオン。緑色ペグをディストラクタとして完全に無視し、誤把持ゼロで赤ペグのみを追跡。</w:t>
+        <w:t>双眼カメラが赤・緑双方を視野内に捉えた状態で、ターゲット指定色（赤）のみを正しく探し出してロックオン。緑色ペグを妨害物（ディストラクタ）として完全に無視し、誤把持ゼロで目的の赤ペグのみを追跡。</w:t>
       </w:r>
     </w:p>
     <w:p>
@@ -7396,7 +8211,7 @@
           <w:color w:val="0F172A"/>
           <w:sz w:val="20"/>
         </w:rPr>
-        <w:t xml:space="preserve">原点 </w:t>
+        <w:t>ハイブリッド構成による低コスト動作基盤の実証</w:t>
       </w:r>
       <w:r>
         <w:rPr>
@@ -7406,26 +8221,6 @@
           <w:color w:val="0F172A"/>
           <w:sz w:val="20"/>
         </w:rPr>
-        <w:t xml:space="preserve">(0, 0) </w:t>
-      </w:r>
-      <w:r>
-        <w:rPr>
-          <w:rFonts w:ascii="Yu Gothic" w:hAnsi="Yu Gothic" w:eastAsia="Yu Gothic"/>
-          <w:b/>
-          <w:i w:val="false"/>
-          <w:color w:val="0F172A"/>
-          <w:sz w:val="20"/>
-        </w:rPr>
-        <w:t>超え任意座標への適応</w:t>
-      </w:r>
-      <w:r>
-        <w:rPr>
-          <w:rFonts w:eastAsia="Yu Gothic" w:ascii="Yu Gothic" w:hAnsi="Yu Gothic"/>
-          <w:b/>
-          <w:i w:val="false"/>
-          <w:color w:val="0F172A"/>
-          <w:sz w:val="20"/>
-        </w:rPr>
         <w:t xml:space="preserve">: </w:t>
       </w:r>
       <w:r>
@@ -7436,27 +8231,67 @@
           <w:color w:val="334155"/>
           <w:sz w:val="20"/>
         </w:rPr>
-        <w:t xml:space="preserve">ペグが </w:t>
-      </w:r>
-      <w:r>
-        <w:rPr>
-          <w:rFonts w:eastAsia="Yu Gothic" w:ascii="Yu Gothic" w:hAnsi="Yu Gothic"/>
-          <w:b w:val="false"/>
-          <w:i w:val="false"/>
-          <w:color w:val="334155"/>
-          <w:sz w:val="20"/>
-        </w:rPr>
-        <w:t xml:space="preserve">Y &gt;= 0 </w:t>
-      </w:r>
-      <w:r>
-        <w:rPr>
-          <w:rFonts w:ascii="Yu Gothic" w:hAnsi="Yu Gothic" w:eastAsia="Yu Gothic"/>
-          <w:b w:val="false"/>
-          <w:i w:val="false"/>
-          <w:color w:val="334155"/>
-          <w:sz w:val="20"/>
-        </w:rPr>
-        <w:t>領域（原点超え）に配置された場合でも、学習時のオーグメンテーション効果により幾何学的特異点を回避し、確実にアプローチを成功。</w:t>
+        <w:t>ペグの探索から穴上空までの滑らかな運搬軌道は【機械学習（生徒</w:t>
+      </w:r>
+      <w:r>
+        <w:rPr>
+          <w:rFonts w:eastAsia="Yu Gothic" w:ascii="Yu Gothic" w:hAnsi="Yu Gothic"/>
+          <w:b w:val="false"/>
+          <w:i w:val="false"/>
+          <w:color w:val="334155"/>
+          <w:sz w:val="20"/>
+        </w:rPr>
+        <w:t>ACT</w:t>
+      </w:r>
+      <w:r>
+        <w:rPr>
+          <w:rFonts w:ascii="Yu Gothic" w:hAnsi="Yu Gothic" w:eastAsia="Yu Gothic"/>
+          <w:b w:val="false"/>
+          <w:i w:val="false"/>
+          <w:color w:val="334155"/>
+          <w:sz w:val="20"/>
+        </w:rPr>
+        <w:t>モデル）】が自律推論し、台座壁への突き当て整列、爪長差を考慮した直立化、接触反力を逃がす解放といった繊細な終端動作は【機械的・機構的制御】が確実に実行。この役割分担により、高価なトルクセンサを持たない安価なロボットアームでも、クリアランス</w:t>
+      </w:r>
+      <w:r>
+        <w:rPr>
+          <w:rFonts w:eastAsia="Yu Gothic" w:ascii="Yu Gothic" w:hAnsi="Yu Gothic"/>
+          <w:b w:val="false"/>
+          <w:i w:val="false"/>
+          <w:color w:val="334155"/>
+          <w:sz w:val="20"/>
+        </w:rPr>
+        <w:t>2mm</w:t>
+      </w:r>
+      <w:r>
+        <w:rPr>
+          <w:rFonts w:ascii="Yu Gothic" w:hAnsi="Yu Gothic" w:eastAsia="Yu Gothic"/>
+          <w:b w:val="false"/>
+          <w:i w:val="false"/>
+          <w:color w:val="334155"/>
+          <w:sz w:val="20"/>
+        </w:rPr>
+        <w:t>の精密挿入を実時間</w:t>
+      </w:r>
+      <w:r>
+        <w:rPr>
+          <w:rFonts w:eastAsia="Yu Gothic" w:ascii="Yu Gothic" w:hAnsi="Yu Gothic"/>
+          <w:b w:val="false"/>
+          <w:i w:val="false"/>
+          <w:color w:val="334155"/>
+          <w:sz w:val="20"/>
+        </w:rPr>
+        <w:t>107.6</w:t>
+      </w:r>
+      <w:r>
+        <w:rPr>
+          <w:rFonts w:ascii="Yu Gothic" w:hAnsi="Yu Gothic" w:eastAsia="Yu Gothic"/>
+          <w:b w:val="false"/>
+          <w:i w:val="false"/>
+          <w:color w:val="334155"/>
+          <w:sz w:val="20"/>
+        </w:rPr>
+        <w:t>秒で完遂できる低コスト動作基盤の実用性を証明しました。</w:t>
       </w:r>
     </w:p>
     <w:p>
@@ -7964,7 +8799,7 @@
           <w:color w:val="334155"/>
           <w:sz w:val="20"/>
         </w:rPr>
-        <w:t>のシビアな円柱ペグインホールタスクに対し、人手データの収集限界をロボット工学的補正制御と視覚サーボの融合によって克服し、自律実演成功率</w:t>
+        <w:t>というシビアな円柱ペグインホールタスクに対し、人手データの収集限界を『高精度物理エキスパートからの自己学習（知識蒸留）』によって克服し、自律実演成功率</w:t>
       </w:r>
       <w:r>
         <w:rPr>
@@ -7984,7 +8819,7 @@
           <w:color w:val="334155"/>
           <w:sz w:val="20"/>
         </w:rPr>
-        <w:t>を達成した。</w:t>
+        <w:t>を達成しました。</w:t>
       </w:r>
     </w:p>
     <w:p>
@@ -8077,7 +8912,7 @@
           <w:color w:val="334155"/>
           <w:sz w:val="20"/>
         </w:rPr>
-        <w:t>モデルへ知識蒸留するループの有効性を実証した。</w:t>
+        <w:t>モデルへ知識蒸留するループの有効性を実証しました。</w:t>
       </w:r>
     </w:p>
     <w:p>
@@ -8100,7 +8935,7 @@
           <w:color w:val="0F172A"/>
           <w:sz w:val="20"/>
         </w:rPr>
-        <w:t>今後の展開</w:t>
+        <w:t>ハイブリッド構成がもたらす産業的価値</w:t>
       </w:r>
       <w:r>
         <w:rPr>
@@ -8120,27 +8955,7 @@
           <w:color w:val="334155"/>
           <w:sz w:val="20"/>
         </w:rPr>
-        <w:t>本アーキテクチャはペグインホールのみならず、ネジ締め、コネクタ嵌合、精密組付けなど、接触を伴う高難度</w:t>
-      </w:r>
-      <w:r>
-        <w:rPr>
-          <w:rFonts w:eastAsia="Yu Gothic" w:ascii="Yu Gothic" w:hAnsi="Yu Gothic"/>
-          <w:b w:val="false"/>
-          <w:i w:val="false"/>
-          <w:color w:val="334155"/>
-          <w:sz w:val="20"/>
-        </w:rPr>
-        <w:t>Physical AI</w:t>
-      </w:r>
-      <w:r>
-        <w:rPr>
-          <w:rFonts w:ascii="Yu Gothic" w:hAnsi="Yu Gothic" w:eastAsia="Yu Gothic"/>
-          <w:b w:val="false"/>
-          <w:i w:val="false"/>
-          <w:color w:val="334155"/>
-          <w:sz w:val="20"/>
-        </w:rPr>
-        <w:t>タスク全般へそのまま適用可能である。</w:t>
+        <w:t>『可動域内から目的物を探索し、アーム動作は機械学習が担い、繊細な接触適応は機械的・幾何学的な制御が担う』というハイブリッド構成を確立しました。高額なハードウェア投資を行わなくても、安価なロボットアームで高度な組立・挿入タスクを実現できることを実証した点に、本成果の極めて大きな実用価値があります。</w:t>
       </w:r>
     </w:p>
     <w:sectPr>

</xml_diff>